<commit_message>
fix: Advice template namespace collision and add multiline docx support; bump v1.2.9
</commit_message>
<xml_diff>
--- a/templates/Advice_Template.docx
+++ b/templates/Advice_Template.docx
@@ -1,159 +1,137 @@
 
 <file path=word/document.xml><?xml version="1.0" encoding="utf-8"?>
-<w:document xmlns:ns1="http://schemas.openxmlformats.org/markup-compatibility/2006" xmlns:ns2="http://schemas.microsoft.com/office/word/2010/wordml" xmlns:ns3="http://schemas.openxmlformats.org/drawingml/2006/wordprocessingDrawing" xmlns:ns4="http://schemas.microsoft.com/office/word/2010/wordprocessingDrawing" xmlns:ns5="http://schemas.openxmlformats.org/drawingml/2006/main" xmlns:ns6="http://schemas.microsoft.com/office/word/2010/wordprocessingShape" xmlns:ns7="urn:schemas-microsoft-com:vml" xmlns:ns8="urn:schemas-microsoft-com:office:office" xmlns:ns9="urn:schemas-microsoft-com:office:word" xmlns:w="http://schemas.openxmlformats.org/wordprocessingml/2006/main" ns1:Ignorable="w14 w15 w16se w16cid w16 w16cex w16sdtdh w16sdtfl w16du wp14">
+<w:document xmlns:wpc="http://schemas.microsoft.com/office/word/2010/wordprocessingCanvas" xmlns:cx="http://schemas.microsoft.com/office/drawing/2014/chartex" xmlns:cx1="http://schemas.microsoft.com/office/drawing/2015/9/8/chartex" xmlns:cx2="http://schemas.microsoft.com/office/drawing/2015/10/21/chartex" xmlns:cx3="http://schemas.microsoft.com/office/drawing/2016/5/9/chartex" xmlns:cx4="http://schemas.microsoft.com/office/drawing/2016/5/10/chartex" xmlns:cx5="http://schemas.microsoft.com/office/drawing/2016/5/11/chartex" xmlns:cx6="http://schemas.microsoft.com/office/drawing/2016/5/12/chartex" xmlns:cx7="http://schemas.microsoft.com/office/drawing/2016/5/13/chartex" xmlns:cx8="http://schemas.microsoft.com/office/drawing/2016/5/14/chartex" xmlns:mc="http://schemas.openxmlformats.org/markup-compatibility/2006" xmlns:aink="http://schemas.microsoft.com/office/drawing/2016/ink" xmlns:am3d="http://schemas.microsoft.com/office/drawing/2017/model3d" xmlns:o="urn:schemas-microsoft-com:office:office" xmlns:oel="http://schemas.microsoft.com/office/2019/extlst" xmlns:r="http://schemas.openxmlformats.org/officeDocument/2006/relationships" xmlns:m="http://schemas.openxmlformats.org/officeDocument/2006/math" xmlns:v="urn:schemas-microsoft-com:vml" xmlns:wp14="http://schemas.microsoft.com/office/word/2010/wordprocessingDrawing" xmlns:wp="http://schemas.openxmlformats.org/drawingml/2006/wordprocessingDrawing" xmlns:w10="urn:schemas-microsoft-com:office:word" xmlns:w="http://schemas.openxmlformats.org/wordprocessingml/2006/main" xmlns:w14="http://schemas.microsoft.com/office/word/2010/wordml" xmlns:w15="http://schemas.microsoft.com/office/word/2012/wordml" xmlns:w16cex="http://schemas.microsoft.com/office/word/2018/wordml/cex" xmlns:w16cid="http://schemas.microsoft.com/office/word/2016/wordml/cid" xmlns:w16="http://schemas.microsoft.com/office/word/2018/wordml" xmlns:w16du="http://schemas.microsoft.com/office/word/2023/wordml/word16du" xmlns:w16sdtdh="http://schemas.microsoft.com/office/word/2020/wordml/sdtdatahash" xmlns:w16sdtfl="http://schemas.microsoft.com/office/word/2024/wordml/sdtformatlock" xmlns:w16se="http://schemas.microsoft.com/office/word/2015/wordml/symex" xmlns:wpg="http://schemas.microsoft.com/office/word/2010/wordprocessingGroup" xmlns:wpi="http://schemas.microsoft.com/office/word/2010/wordprocessingInk" xmlns:wne="http://schemas.microsoft.com/office/word/2006/wordml" xmlns:wps="http://schemas.microsoft.com/office/word/2010/wordprocessingShape" mc:Ignorable="w14 w15 w16se w16cid w16 w16cex w16sdtdh w16sdtfl w16du wp14">
   <w:body>
-    <w:p ns2:paraId="1036769B" ns2:textId="5DFE8503"/>
-    <w:p ns2:paraId="46B6CAA6" ns2:textId="77777777"/>
-    <w:p ns2:paraId="3EE1766F" ns2:textId="77777777"/>
-    <w:p ns2:paraId="32A54B4F" ns2:textId="77777777"/>
-    <w:p ns2:paraId="5E439419" ns2:textId="77777777"/>
-    <w:p ns2:paraId="3A769745" ns2:textId="77777777"/>
-    <w:p ns2:paraId="7EBE72B2" ns2:textId="77777777"/>
-    <w:p ns2:paraId="0610A893" ns2:textId="77777777"/>
-    <w:p ns2:paraId="051C8812" ns2:textId="77777777"/>
-    <w:p ns2:paraId="43C38AB2" ns2:textId="77777777"/>
-    <w:p ns2:paraId="5D6D32AC" ns2:textId="77777777"/>
-    <w:p ns2:paraId="7CFA47A1" ns2:textId="77777777"/>
-    <w:p ns2:paraId="57D85380" ns2:textId="77777777"/>
-    <w:p ns2:paraId="50EA9B57" ns2:textId="77777777"/>
-    <w:p ns2:paraId="2BEB7BD2" ns2:textId="77777777"/>
-    <w:p ns2:paraId="482E6BF0" ns2:textId="77777777"/>
-    <w:p ns2:paraId="7EBA0B4F" ns2:textId="77777777"/>
-    <w:p ns2:paraId="3313A61E" ns2:textId="77777777"/>
-    <w:p ns2:paraId="75684188" ns2:textId="77777777"/>
-    <w:p ns2:paraId="11A4CB49" ns2:textId="77777777"/>
-    <w:p ns2:paraId="6F09B920" ns2:textId="77777777"/>
-    <w:p ns2:paraId="745380EB" ns2:textId="77777777"/>
-    <w:p ns2:paraId="1FF72788" ns2:textId="77777777"/>
-    <w:p ns2:paraId="0C480D25" ns2:textId="7AA3F0AF">
+    <w:p/>
+    <w:p/>
+    <w:p/>
+    <w:p/>
+    <w:p/>
+    <w:p/>
+    <w:p/>
+    <w:p/>
+    <w:p/>
+    <w:p/>
+    <w:p/>
+    <w:p/>
+    <w:p/>
+    <w:p/>
+    <w:p/>
+    <w:p/>
+    <w:p/>
+    <w:p/>
+    <w:p/>
+    <w:p/>
+    <w:p/>
+    <w:p/>
+    <w:p/>
+    <w:p>
       <w:r>
         <w:rPr>
           <w:noProof/>
         </w:rPr>
-        <ns1:AlternateContent>
-          <ns1:Choice Requires="wps">
+        <mc:AlternateContent>
+          <mc:Choice Requires="wps">
             <w:drawing>
-              <ns3:anchor distT="45720" distB="45720" distL="114300" distR="114300" simplePos="0" relativeHeight="251659264" behindDoc="0" locked="0" layoutInCell="1" allowOverlap="1" ns4:anchorId="556DC657" ns4:editId="5E775FE0">
-                <ns3:simplePos x="0" y="0"/>
-                <ns3:positionH relativeFrom="margin">
-                  <ns3:posOffset>5548300</ns3:posOffset>
-                </ns3:positionH>
-                <ns3:positionV relativeFrom="paragraph">
-                  <ns3:posOffset>226771</ns3:posOffset>
-                </ns3:positionV>
-                <ns3:extent cx="3897630" cy="6049645"/>
-                <ns3:effectExtent l="0" t="0" r="13335" b="27305"/>
-                <ns3:wrapSquare wrapText="bothSides"/>
-                <ns3:docPr id="217" name="กล่องข้อความ 2"/>
-                <ns3:cNvGraphicFramePr>
-                  <ns5:graphicFrameLocks/>
-                </ns3:cNvGraphicFramePr>
-                <ns5:graphic>
-                  <ns5:graphicData uri="http://schemas.microsoft.com/office/word/2010/wordprocessingShape">
-                    <ns6:wsp>
-                      <ns6:cNvSpPr txBox="1">
-                        <ns5:spLocks noChangeArrowheads="1"/>
-                      </ns6:cNvSpPr>
-                      <ns6:spPr bwMode="auto">
-                        <ns5:xfrm>
-                          <ns5:off x="0" y="0"/>
-                          <ns5:ext cx="3897630" cy="6049645"/>
-                        </ns5:xfrm>
-                        <ns5:prstGeom prst="rect">
-                          <ns5:avLst/>
-                        </ns5:prstGeom>
-                        <ns5:noFill/>
-                        <ns5:ln w="9525">
-                          <ns5:solidFill>
-                            <ns5:srgbClr val="000000"/>
-                          </ns5:solidFill>
-                          <ns5:miter lim="800000"/>
-                          <ns5:headEnd/>
-                          <ns5:tailEnd/>
-                        </ns5:ln>
-                      </ns6:spPr>
-                      <ns6:txbx>
+              <wp:anchor distT="45720" distB="45720" distL="114300" distR="114300" simplePos="0" relativeHeight="251659264" behindDoc="0" locked="0" layoutInCell="1" allowOverlap="1" wp14:anchorId="556DC657" wp14:editId="5E775FE0">
+                <wp:simplePos x="0" y="0"/>
+                <wp:positionH relativeFrom="margin">
+                  <wp:posOffset>5548300</wp:posOffset>
+                </wp:positionH>
+                <wp:positionV relativeFrom="paragraph">
+                  <wp:posOffset>226771</wp:posOffset>
+                </wp:positionV>
+                <wp:extent cx="3897630" cy="6049645"/>
+                <wp:effectExtent l="0" t="0" r="13335" b="27305"/>
+                <wp:wrapSquare wrapText="bothSides"/>
+                <wp:docPr id="217" name="กล่องข้อความ 2"/>
+                <wp:cNvGraphicFramePr>
+                  <a:graphicFrameLocks xmlns:a="http://schemas.openxmlformats.org/drawingml/2006/main"/>
+                </wp:cNvGraphicFramePr>
+                <a:graphic xmlns:a="http://schemas.openxmlformats.org/drawingml/2006/main">
+                  <a:graphicData uri="http://schemas.microsoft.com/office/word/2010/wordprocessingShape">
+                    <wps:wsp>
+                      <wps:cNvSpPr txBox="1">
+                        <a:spLocks noChangeArrowheads="1"/>
+                      </wps:cNvSpPr>
+                      <wps:spPr bwMode="auto">
+                        <a:xfrm>
+                          <a:off x="0" y="0"/>
+                          <a:ext cx="3897630" cy="6049645"/>
+                        </a:xfrm>
+                        <a:prstGeom prst="rect">
+                          <a:avLst/>
+                        </a:prstGeom>
+                        <a:noFill/>
+                        <a:ln w="9525">
+                          <a:solidFill>
+                            <a:srgbClr val="000000"/>
+                          </a:solidFill>
+                          <a:miter lim="800000"/>
+                          <a:headEnd/>
+                          <a:tailEnd/>
+                        </a:ln>
+                      </wps:spPr>
+                      <wps:txbx>
                         <w:txbxContent>
-                          <w:p ns2:paraId="0101FDA4" ns2:textId="7E530A77">
-                            <w:pPr>
-                              <w:rPr>
-                                <w:rFonts w:ascii="TH Sarabun New" w:hAnsi="TH Sarabun New" w:cs="TH Sarabun New" w:hint="cs"/>
-                                <w:b/>
-                                <w:bCs/>
-                                <w:color w:val="222A35" w:themeColor="text2" w:themeShade="80"/>
-                                <w:sz w:val="18"/>
-                                <w:szCs w:val="22"/>
-                                <w:u w:val="single"/>
-                              </w:rPr>
-                            </w:pPr>
+                          <w:p>
                             <w:r>
                               <w:rPr>
+                                <w:rFonts w:ascii="TH SarabunPSK" w:hAnsi="TH SarabunPSK" w:cs="TH SarabunPSK"/>
                                 <w:sz w:val="28"/>
                                 <w:szCs w:val="28"/>
-                                <w:rFonts w:ascii="TH SarabunPSK" w:hAnsi="TH SarabunPSK" w:cs="TH SarabunPSK"/>
                               </w:rPr>
                               <w:t>{Discharge_Advice}</w:t>
                             </w:r>
                           </w:p>
                         </w:txbxContent>
-                      </ns6:txbx>
-                      <ns6:bodyPr rot="0" vert="horz" wrap="square" lIns="91440" tIns="45720" rIns="91440" bIns="45720" anchor="t" anchorCtr="0">
-                        <ns5:spAutoFit/>
-                      </ns6:bodyPr>
-                    </ns6:wsp>
-                  </ns5:graphicData>
-                </ns5:graphic>
-                <ns4:sizeRelH relativeFrom="margin">
-                  <ns4:pctWidth>40000</ns4:pctWidth>
-                </ns4:sizeRelH>
-                <ns4:sizeRelV relativeFrom="margin">
-                  <ns4:pctHeight>20000</ns4:pctHeight>
-                </ns4:sizeRelV>
-              </ns3:anchor>
+                      </wps:txbx>
+                      <wps:bodyPr rot="0" vert="horz" wrap="square" lIns="91440" tIns="45720" rIns="91440" bIns="45720" anchor="t" anchorCtr="0">
+                        <a:spAutoFit/>
+                      </wps:bodyPr>
+                    </wps:wsp>
+                  </a:graphicData>
+                </a:graphic>
+                <wp14:sizeRelH relativeFrom="margin">
+                  <wp14:pctWidth>40000</wp14:pctWidth>
+                </wp14:sizeRelH>
+                <wp14:sizeRelV relativeFrom="margin">
+                  <wp14:pctHeight>20000</wp14:pctHeight>
+                </wp14:sizeRelV>
+              </wp:anchor>
             </w:drawing>
-          </ns1:Choice>
-          <ns1:Fallback>
+          </mc:Choice>
+          <mc:Fallback>
             <w:pict>
-              <ns7:shapetype ns2:anchorId="556DC657" id="_x0000_t202" coordsize="21600,21600" ns8:spt="202" path="m,l,21600r21600,l21600,xe">
-                <ns7:stroke joinstyle="miter"/>
-                <ns7:path gradientshapeok="t" ns8:connecttype="rect"/>
-              </ns7:shapetype>
-              <ns7:shape id="กล่องข้อความ 2" ns8:spid="_x0000_s1026" type="#_x0000_t202" style="position:absolute;margin-left:436.85pt;margin-top:17.85pt;width:306.9pt;height:476.35pt;z-index:251659264;visibility:visible;mso-wrap-style:square;mso-width-percent:400;mso-height-percent:200;mso-wrap-distance-left:9pt;mso-wrap-distance-top:3.6pt;mso-wrap-distance-right:9pt;mso-wrap-distance-bottom:3.6pt;mso-position-horizontal:absolute;mso-position-horizontal-relative:margin;mso-position-vertical:absolute;mso-position-vertical-relative:text;mso-width-percent:400;mso-height-percent:200;mso-width-relative:margin;mso-height-relative:margin;v-text-anchor:top" ns8:gfxdata="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" filled="f">
-                <ns7:textbox style="mso-fit-shape-to-text:t">
+              <v:shapetype w14:anchorId="556DC657" id="_x0000_t202" coordsize="21600,21600" o:spt="202" path="m,l,21600r21600,l21600,xe">
+                <v:stroke joinstyle="miter"/>
+                <v:path gradientshapeok="t" o:connecttype="rect"/>
+              </v:shapetype>
+              <v:shape id="กล่องข้อความ 2" o:spid="_x0000_s1026" type="#_x0000_t202" style="position:absolute;margin-left:436.85pt;margin-top:17.85pt;width:306.9pt;height:476.35pt;z-index:251659264;visibility:visible;mso-wrap-style:square;mso-width-percent:400;mso-height-percent:200;mso-wrap-distance-left:9pt;mso-wrap-distance-top:3.6pt;mso-wrap-distance-right:9pt;mso-wrap-distance-bottom:3.6pt;mso-position-horizontal:absolute;mso-position-horizontal-relative:margin;mso-position-vertical:absolute;mso-position-vertical-relative:text;mso-width-percent:400;mso-height-percent:200;mso-width-relative:margin;mso-height-relative:margin;v-text-anchor:top" o:gfxdata="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" filled="f">
+                <v:textbox style="mso-fit-shape-to-text:t">
                   <w:txbxContent>
-                    <w:p ns2:paraId="0101FDA4" ns2:textId="7E530A77">
-                      <w:pPr>
-                        <w:rPr>
-                          <w:rFonts w:ascii="TH Sarabun New" w:hAnsi="TH Sarabun New" w:cs="TH Sarabun New" w:hint="cs"/>
-                          <w:b/>
-                          <w:bCs/>
-                          <w:color w:val="222A35" w:themeColor="text2" w:themeShade="80"/>
-                          <w:sz w:val="18"/>
-                          <w:szCs w:val="22"/>
-                          <w:u w:val="single"/>
-                        </w:rPr>
-                      </w:pPr>
+                    <w:p>
                       <w:r>
                         <w:rPr>
+                          <w:rFonts w:ascii="TH SarabunPSK" w:hAnsi="TH SarabunPSK" w:cs="TH SarabunPSK"/>
                           <w:sz w:val="28"/>
                           <w:szCs w:val="28"/>
-                          <w:rFonts w:ascii="TH SarabunPSK" w:hAnsi="TH SarabunPSK" w:cs="TH SarabunPSK"/>
                         </w:rPr>
                         <w:t>{Discharge_Advice}</w:t>
                       </w:r>
                     </w:p>
                   </w:txbxContent>
-                </ns7:textbox>
-                <ns9:wrap type="square" anchorx="margin"/>
-              </ns7:shape>
+                </v:textbox>
+                <w10:wrap type="square" anchorx="margin"/>
+              </v:shape>
             </w:pict>
-          </ns1:Fallback>
-        </ns1:AlternateContent>
+          </mc:Fallback>
+        </mc:AlternateContent>
       </w:r>
     </w:p>
-    <w:p ns2:paraId="2DA03605" ns2:textId="77777777"/>
-    <w:p ns2:paraId="57FF1F01" ns2:textId="77777777"/>
-    <w:p ns2:paraId="1939BC6C" ns2:textId="31468D35"/>
+    <w:p/>
+    <w:p/>
+    <w:p/>
     <w:sectPr>
       <w:pgSz w:w="16838" w:h="11906" w:orient="landscape" w:code="9"/>
       <w:pgMar w:top="720" w:right="720" w:bottom="720" w:left="720" w:header="720" w:footer="720" w:gutter="0"/>

</xml_diff>

<commit_message>
chore: Update Advice_Template with user's beautiful layout and bump v1.3.1
</commit_message>
<xml_diff>
--- a/templates/Advice_Template.docx
+++ b/templates/Advice_Template.docx
@@ -1,6 +1,6 @@
 
 <file path=word/document.xml><?xml version="1.0" encoding="utf-8"?>
-<w:document xmlns:wpc="http://schemas.microsoft.com/office/word/2010/wordprocessingCanvas" xmlns:cx="http://schemas.microsoft.com/office/drawing/2014/chartex" xmlns:cx1="http://schemas.microsoft.com/office/drawing/2015/9/8/chartex" xmlns:cx2="http://schemas.microsoft.com/office/drawing/2015/10/21/chartex" xmlns:cx3="http://schemas.microsoft.com/office/drawing/2016/5/9/chartex" xmlns:cx4="http://schemas.microsoft.com/office/drawing/2016/5/10/chartex" xmlns:cx5="http://schemas.microsoft.com/office/drawing/2016/5/11/chartex" xmlns:cx6="http://schemas.microsoft.com/office/drawing/2016/5/12/chartex" xmlns:cx7="http://schemas.microsoft.com/office/drawing/2016/5/13/chartex" xmlns:cx8="http://schemas.microsoft.com/office/drawing/2016/5/14/chartex" xmlns:mc="http://schemas.openxmlformats.org/markup-compatibility/2006" xmlns:aink="http://schemas.microsoft.com/office/drawing/2016/ink" xmlns:am3d="http://schemas.microsoft.com/office/drawing/2017/model3d" xmlns:o="urn:schemas-microsoft-com:office:office" xmlns:oel="http://schemas.microsoft.com/office/2019/extlst" xmlns:r="http://schemas.openxmlformats.org/officeDocument/2006/relationships" xmlns:m="http://schemas.openxmlformats.org/officeDocument/2006/math" xmlns:v="urn:schemas-microsoft-com:vml" xmlns:wp14="http://schemas.microsoft.com/office/word/2010/wordprocessingDrawing" xmlns:wp="http://schemas.openxmlformats.org/drawingml/2006/wordprocessingDrawing" xmlns:w10="urn:schemas-microsoft-com:office:word" xmlns:w="http://schemas.openxmlformats.org/wordprocessingml/2006/main" xmlns:w14="http://schemas.microsoft.com/office/word/2010/wordml" xmlns:w15="http://schemas.microsoft.com/office/word/2012/wordml" xmlns:w16cex="http://schemas.microsoft.com/office/word/2018/wordml/cex" xmlns:w16cid="http://schemas.microsoft.com/office/word/2016/wordml/cid" xmlns:w16="http://schemas.microsoft.com/office/word/2018/wordml" xmlns:w16du="http://schemas.microsoft.com/office/word/2023/wordml/word16du" xmlns:w16sdtdh="http://schemas.microsoft.com/office/word/2020/wordml/sdtdatahash" xmlns:w16sdtfl="http://schemas.microsoft.com/office/word/2024/wordml/sdtformatlock" xmlns:w16se="http://schemas.microsoft.com/office/word/2015/wordml/symex" xmlns:wpg="http://schemas.microsoft.com/office/word/2010/wordprocessingGroup" xmlns:wpi="http://schemas.microsoft.com/office/word/2010/wordprocessingInk" xmlns:wne="http://schemas.microsoft.com/office/word/2006/wordml" xmlns:wps="http://schemas.microsoft.com/office/word/2010/wordprocessingShape" mc:Ignorable="w14 w15 w16se w16cid w16 w16cex w16sdtdh w16sdtfl w16du wp14">
+<w:document xmlns:wpc="http://schemas.microsoft.com/office/word/2010/wordprocessingCanvas" xmlns:cx="http://schemas.microsoft.com/office/drawing/2014/chartex" xmlns:cx1="http://schemas.microsoft.com/office/drawing/2015/9/8/chartex" xmlns:cx2="http://schemas.microsoft.com/office/drawing/2015/10/21/chartex" xmlns:cx3="http://schemas.microsoft.com/office/drawing/2016/5/9/chartex" xmlns:cx4="http://schemas.microsoft.com/office/drawing/2016/5/10/chartex" xmlns:cx5="http://schemas.microsoft.com/office/drawing/2016/5/11/chartex" xmlns:cx6="http://schemas.microsoft.com/office/drawing/2016/5/12/chartex" xmlns:cx7="http://schemas.microsoft.com/office/drawing/2016/5/13/chartex" xmlns:cx8="http://schemas.microsoft.com/office/drawing/2016/5/14/chartex" xmlns:mc="http://schemas.openxmlformats.org/markup-compatibility/2006" xmlns:aink="http://schemas.microsoft.com/office/drawing/2016/ink" xmlns:am3d="http://schemas.microsoft.com/office/drawing/2017/model3d" xmlns:o="urn:schemas-microsoft-com:office:office" xmlns:r="http://schemas.openxmlformats.org/officeDocument/2006/relationships" xmlns:m="http://schemas.openxmlformats.org/officeDocument/2006/math" xmlns:v="urn:schemas-microsoft-com:vml" xmlns:wp14="http://schemas.microsoft.com/office/word/2010/wordprocessingDrawing" xmlns:wp="http://schemas.openxmlformats.org/drawingml/2006/wordprocessingDrawing" xmlns:w10="urn:schemas-microsoft-com:office:word" xmlns:w="http://schemas.openxmlformats.org/wordprocessingml/2006/main" xmlns:w14="http://schemas.microsoft.com/office/word/2010/wordml" xmlns:w15="http://schemas.microsoft.com/office/word/2012/wordml" xmlns:w16cex="http://schemas.microsoft.com/office/word/2018/wordml/cex" xmlns:w16cid="http://schemas.microsoft.com/office/word/2016/wordml/cid" xmlns:w16="http://schemas.microsoft.com/office/word/2018/wordml" xmlns:w16sdtdh="http://schemas.microsoft.com/office/word/2020/wordml/sdtdatahash" xmlns:w16se="http://schemas.microsoft.com/office/word/2015/wordml/symex" xmlns:wpg="http://schemas.microsoft.com/office/word/2010/wordprocessingGroup" xmlns:wpi="http://schemas.microsoft.com/office/word/2010/wordprocessingInk" xmlns:wne="http://schemas.microsoft.com/office/word/2006/wordml" xmlns:wps="http://schemas.microsoft.com/office/word/2010/wordprocessingShape" mc:Ignorable="w14 w15 w16se w16cid w16 w16cex w16sdtdh wp14">
   <w:body>
     <w:p/>
     <w:p/>
@@ -33,16 +33,16 @@
         <mc:AlternateContent>
           <mc:Choice Requires="wps">
             <w:drawing>
-              <wp:anchor distT="45720" distB="45720" distL="114300" distR="114300" simplePos="0" relativeHeight="251659264" behindDoc="0" locked="0" layoutInCell="1" allowOverlap="1" wp14:anchorId="556DC657" wp14:editId="5E775FE0">
+              <wp:anchor distT="45720" distB="45720" distL="114300" distR="114300" simplePos="0" relativeHeight="251659264" behindDoc="0" locked="0" layoutInCell="1" allowOverlap="1" wp14:anchorId="6A688D95" wp14:editId="2F03CF34">
                 <wp:simplePos x="0" y="0"/>
                 <wp:positionH relativeFrom="margin">
-                  <wp:posOffset>5548300</wp:posOffset>
+                  <wp:posOffset>5551170</wp:posOffset>
                 </wp:positionH>
                 <wp:positionV relativeFrom="paragraph">
-                  <wp:posOffset>226771</wp:posOffset>
+                  <wp:posOffset>4445</wp:posOffset>
                 </wp:positionV>
-                <wp:extent cx="3897630" cy="6049645"/>
-                <wp:effectExtent l="0" t="0" r="13335" b="27305"/>
+                <wp:extent cx="3897630" cy="6380480"/>
+                <wp:effectExtent l="0" t="0" r="13335" b="7620"/>
                 <wp:wrapSquare wrapText="bothSides"/>
                 <wp:docPr id="217" name="กล่องข้อความ 2"/>
                 <wp:cNvGraphicFramePr>
@@ -57,7 +57,7 @@
                       <wps:spPr bwMode="auto">
                         <a:xfrm>
                           <a:off x="0" y="0"/>
-                          <a:ext cx="3897630" cy="6049645"/>
+                          <a:ext cx="3897630" cy="6380480"/>
                         </a:xfrm>
                         <a:prstGeom prst="rect">
                           <a:avLst/>
@@ -75,19 +75,302 @@
                       <wps:txbx>
                         <w:txbxContent>
                           <w:p>
+                            <w:pPr>
+                              <w:jc w:val="center"/>
+                              <w:rPr>
+                                <w:rFonts w:ascii="TH SarabunPSK" w:hAnsi="TH SarabunPSK" w:cs="TH SarabunPSK"/>
+                                <w:b/>
+                                <w:bCs/>
+                                <w:sz w:val="32"/>
+                                <w:szCs w:val="32"/>
+                                <w:u w:val="single"/>
+                              </w:rPr>
+                            </w:pPr>
                             <w:r>
                               <w:rPr>
                                 <w:rFonts w:ascii="TH SarabunPSK" w:hAnsi="TH SarabunPSK" w:cs="TH SarabunPSK"/>
-                                <w:sz w:val="28"/>
-                                <w:szCs w:val="28"/>
-                              </w:rPr>
-                              <w:t>{Discharge_Advice}</w:t>
+                                <w:b/>
+                                <w:bCs/>
+                                <w:sz w:val="32"/>
+                                <w:szCs w:val="32"/>
+                                <w:u w:val="single"/>
+                                <w:cs/>
+                              </w:rPr>
+                              <w:t>คำแนะนำการดูแลตนเองและข้อควรปฏิบัติ</w:t>
                             </w:r>
+                          </w:p>
+                          <w:p>
+                            <w:pPr>
+                              <w:rPr>
+                                <w:rFonts w:ascii="TH SarabunPSK" w:hAnsi="TH SarabunPSK" w:cs="TH SarabunPSK"/>
+                                <w:sz w:val="28"/>
+                              </w:rPr>
+                            </w:pPr>
+                            <w:r>
+                              <w:rPr>
+                                <w:rFonts w:ascii="Apple Color Emoji" w:hAnsi="Apple Color Emoji" w:cs="Apple Color Emoji"/>
+                                <w:sz w:val="28"/>
+                              </w:rPr>
+                              <w:t>🩺</w:t>
+                            </w:r>
+                            <w:r>
+                              <w:rPr>
+                                <w:rFonts w:ascii="TH SarabunPSK" w:hAnsi="TH SarabunPSK" w:cs="TH SarabunPSK"/>
+                                <w:sz w:val="28"/>
+                              </w:rPr>
+                              <w:t xml:space="preserve"> </w:t>
+                            </w:r>
+                            <w:r>
+                              <w:rPr>
+                                <w:rFonts w:ascii="TH SarabunPSK" w:hAnsi="TH SarabunPSK" w:cs="TH SarabunPSK"/>
+                                <w:sz w:val="28"/>
+                                <w:cs/>
+                              </w:rPr>
+                              <w:t>วันนี้เป็นอะไร (การวินิจฉัย):</w:t>
+                            </w:r>
+                          </w:p>
+                          <w:p>
+                            <w:pPr>
+                              <w:pStyle w:val="ListParagraph"/>
+                              <w:numPr>
+                                <w:ilvl w:val="0"/>
+                                <w:numId w:val="8"/>
+                              </w:numPr>
+                              <w:rPr>
+                                <w:rFonts w:ascii="TH SarabunPSK" w:hAnsi="TH SarabunPSK" w:cs="TH SarabunPSK"/>
+                                <w:sz w:val="28"/>
+                              </w:rPr>
+                            </w:pPr>
+                            <w:r>
+                              <w:rPr>
+                                <w:rFonts w:ascii="TH SarabunPSK" w:hAnsi="TH SarabunPSK" w:cs="TH SarabunPSK"/>
+                                <w:sz w:val="28"/>
+                              </w:rPr>
+                              <w:t>{</w:t>
+                            </w:r>
+                            <w:proofErr w:type="spellStart"/>
+                            <w:r>
+                              <w:rPr>
+                                <w:rFonts w:ascii="TH SarabunPSK" w:hAnsi="TH SarabunPSK" w:cs="TH SarabunPSK"/>
+                                <w:sz w:val="28"/>
+                              </w:rPr>
+                              <w:t>Advice_Dx</w:t>
+                            </w:r>
+                            <w:proofErr w:type="spellEnd"/>
+                            <w:r>
+                              <w:rPr>
+                                <w:rFonts w:ascii="TH SarabunPSK" w:hAnsi="TH SarabunPSK" w:cs="TH SarabunPSK"/>
+                                <w:sz w:val="28"/>
+                              </w:rPr>
+                              <w:t>}</w:t>
+                            </w:r>
+                          </w:p>
+                          <w:p>
+                            <w:pPr>
+                              <w:rPr>
+                                <w:rFonts w:ascii="TH SarabunPSK" w:hAnsi="TH SarabunPSK" w:cs="TH SarabunPSK"/>
+                                <w:sz w:val="28"/>
+                              </w:rPr>
+                            </w:pPr>
+                            <w:r>
+                              <w:rPr>
+                                <w:rFonts w:ascii="Apple Color Emoji" w:hAnsi="Apple Color Emoji" w:cs="Apple Color Emoji"/>
+                                <w:sz w:val="28"/>
+                              </w:rPr>
+                              <w:t>💉</w:t>
+                            </w:r>
+                            <w:r>
+                              <w:rPr>
+                                <w:rFonts w:ascii="TH SarabunPSK" w:hAnsi="TH SarabunPSK" w:cs="TH SarabunPSK"/>
+                                <w:sz w:val="28"/>
+                              </w:rPr>
+                              <w:t xml:space="preserve"> </w:t>
+                            </w:r>
+                            <w:r>
+                              <w:rPr>
+                                <w:rFonts w:ascii="TH SarabunPSK" w:hAnsi="TH SarabunPSK" w:cs="TH SarabunPSK"/>
+                                <w:sz w:val="28"/>
+                                <w:cs/>
+                              </w:rPr>
+                              <w:t>การรักษาที่ได้รับไปแล้ว:</w:t>
+                            </w:r>
+                          </w:p>
+                          <w:p>
+                            <w:pPr>
+                              <w:pStyle w:val="ListParagraph"/>
+                              <w:numPr>
+                                <w:ilvl w:val="0"/>
+                                <w:numId w:val="7"/>
+                              </w:numPr>
+                              <w:rPr>
+                                <w:rFonts w:ascii="TH SarabunPSK" w:hAnsi="TH SarabunPSK" w:cs="TH SarabunPSK"/>
+                                <w:sz w:val="28"/>
+                              </w:rPr>
+                            </w:pPr>
+                            <w:r>
+                              <w:rPr>
+                                <w:rFonts w:ascii="TH SarabunPSK" w:hAnsi="TH SarabunPSK" w:cs="TH SarabunPSK"/>
+                                <w:sz w:val="28"/>
+                              </w:rPr>
+                              <w:t>{</w:t>
+                            </w:r>
+                            <w:proofErr w:type="spellStart"/>
+                            <w:r>
+                              <w:rPr>
+                                <w:rFonts w:ascii="TH SarabunPSK" w:hAnsi="TH SarabunPSK" w:cs="TH SarabunPSK"/>
+                                <w:sz w:val="28"/>
+                              </w:rPr>
+                              <w:t>Advice_Tx</w:t>
+                            </w:r>
+                            <w:proofErr w:type="spellEnd"/>
+                            <w:r>
+                              <w:rPr>
+                                <w:rFonts w:ascii="TH SarabunPSK" w:hAnsi="TH SarabunPSK" w:cs="TH SarabunPSK"/>
+                                <w:sz w:val="28"/>
+                              </w:rPr>
+                              <w:t>}</w:t>
+                            </w:r>
+                          </w:p>
+                          <w:p>
+                            <w:pPr>
+                              <w:rPr>
+                                <w:rFonts w:ascii="TH SarabunPSK" w:hAnsi="TH SarabunPSK" w:cs="TH SarabunPSK"/>
+                                <w:sz w:val="28"/>
+                              </w:rPr>
+                            </w:pPr>
+                            <w:r>
+                              <w:rPr>
+                                <w:rFonts w:ascii="Apple Color Emoji" w:hAnsi="Apple Color Emoji" w:cs="Apple Color Emoji"/>
+                                <w:sz w:val="28"/>
+                              </w:rPr>
+                              <w:t>🏠</w:t>
+                            </w:r>
+                            <w:r>
+                              <w:rPr>
+                                <w:rFonts w:ascii="TH SarabunPSK" w:hAnsi="TH SarabunPSK" w:cs="TH SarabunPSK"/>
+                                <w:sz w:val="28"/>
+                              </w:rPr>
+                              <w:t xml:space="preserve"> </w:t>
+                            </w:r>
+                            <w:r>
+                              <w:rPr>
+                                <w:rFonts w:ascii="TH SarabunPSK" w:hAnsi="TH SarabunPSK" w:cs="TH SarabunPSK"/>
+                                <w:sz w:val="28"/>
+                                <w:cs/>
+                              </w:rPr>
+                              <w:t>ให้ทำอย่างไรต่อเมื่อกลับบ้าน:</w:t>
+                            </w:r>
+                          </w:p>
+                          <w:p>
+                            <w:pPr>
+                              <w:pStyle w:val="ListParagraph"/>
+                              <w:numPr>
+                                <w:ilvl w:val="0"/>
+                                <w:numId w:val="7"/>
+                              </w:numPr>
+                              <w:rPr>
+                                <w:rFonts w:ascii="TH SarabunPSK" w:hAnsi="TH SarabunPSK" w:cs="TH SarabunPSK"/>
+                                <w:sz w:val="28"/>
+                              </w:rPr>
+                            </w:pPr>
+                            <w:r>
+                              <w:rPr>
+                                <w:rFonts w:ascii="TH SarabunPSK" w:hAnsi="TH SarabunPSK" w:cs="TH SarabunPSK"/>
+                                <w:sz w:val="28"/>
+                              </w:rPr>
+                              <w:t>{</w:t>
+                            </w:r>
+                            <w:proofErr w:type="spellStart"/>
+                            <w:r>
+                              <w:rPr>
+                                <w:rFonts w:ascii="TH SarabunPSK" w:hAnsi="TH SarabunPSK" w:cs="TH SarabunPSK"/>
+                                <w:sz w:val="28"/>
+                              </w:rPr>
+                              <w:t>Advice_Home</w:t>
+                            </w:r>
+                            <w:proofErr w:type="spellEnd"/>
+                            <w:r>
+                              <w:rPr>
+                                <w:rFonts w:ascii="TH SarabunPSK" w:hAnsi="TH SarabunPSK" w:cs="TH SarabunPSK"/>
+                                <w:sz w:val="28"/>
+                              </w:rPr>
+                              <w:t>}</w:t>
+                            </w:r>
+                          </w:p>
+                          <w:p>
+                            <w:pPr>
+                              <w:rPr>
+                                <w:rFonts w:ascii="TH SarabunPSK" w:hAnsi="TH SarabunPSK" w:cs="TH SarabunPSK"/>
+                                <w:sz w:val="28"/>
+                              </w:rPr>
+                            </w:pPr>
+                            <w:r>
+                              <w:rPr>
+                                <w:rFonts w:ascii="Apple Color Emoji" w:hAnsi="Apple Color Emoji" w:cs="Apple Color Emoji"/>
+                                <w:sz w:val="28"/>
+                              </w:rPr>
+                              <w:t>🚨</w:t>
+                            </w:r>
+                            <w:r>
+                              <w:rPr>
+                                <w:rFonts w:ascii="TH SarabunPSK" w:hAnsi="TH SarabunPSK" w:cs="TH SarabunPSK"/>
+                                <w:sz w:val="28"/>
+                              </w:rPr>
+                              <w:t xml:space="preserve"> </w:t>
+                            </w:r>
+                            <w:r>
+                              <w:rPr>
+                                <w:rFonts w:ascii="TH SarabunPSK" w:hAnsi="TH SarabunPSK" w:cs="TH SarabunPSK"/>
+                                <w:sz w:val="28"/>
+                                <w:cs/>
+                              </w:rPr>
+                              <w:t>อาการอันตรายที่ต้องรีบกลับมาพบแพทย์ทันที:</w:t>
+                            </w:r>
+                          </w:p>
+                          <w:p>
+                            <w:pPr>
+                              <w:pStyle w:val="ListParagraph"/>
+                              <w:numPr>
+                                <w:ilvl w:val="0"/>
+                                <w:numId w:val="7"/>
+                              </w:numPr>
+                              <w:rPr>
+                                <w:sz w:val="28"/>
+                              </w:rPr>
+                            </w:pPr>
+                            <w:r>
+                              <w:rPr>
+                                <w:rFonts w:ascii="TH SarabunPSK" w:hAnsi="TH SarabunPSK" w:cs="TH SarabunPSK"/>
+                                <w:sz w:val="28"/>
+                              </w:rPr>
+                              <w:t>{</w:t>
+                            </w:r>
+                            <w:proofErr w:type="spellStart"/>
+                            <w:r>
+                              <w:rPr>
+                                <w:rFonts w:ascii="TH SarabunPSK" w:hAnsi="TH SarabunPSK" w:cs="TH SarabunPSK"/>
+                                <w:sz w:val="28"/>
+                              </w:rPr>
+                              <w:t>Advice_RedFlags</w:t>
+                            </w:r>
+                            <w:proofErr w:type="spellEnd"/>
+                            <w:r>
+                              <w:rPr>
+                                <w:rFonts w:ascii="TH SarabunPSK" w:hAnsi="TH SarabunPSK" w:cs="TH SarabunPSK"/>
+                                <w:sz w:val="28"/>
+                              </w:rPr>
+                              <w:t>}</w:t>
+                            </w:r>
+                          </w:p>
+                          <w:p>
+                            <w:pPr>
+                              <w:ind w:left="360"/>
+                            </w:pPr>
                           </w:p>
                         </w:txbxContent>
                       </wps:txbx>
                       <wps:bodyPr rot="0" vert="horz" wrap="square" lIns="91440" tIns="45720" rIns="91440" bIns="45720" anchor="t" anchorCtr="0">
-                        <a:spAutoFit/>
+                        <a:noAutofit/>
                       </wps:bodyPr>
                     </wps:wsp>
                   </a:graphicData>
@@ -96,29 +379,312 @@
                   <wp14:pctWidth>40000</wp14:pctWidth>
                 </wp14:sizeRelH>
                 <wp14:sizeRelV relativeFrom="margin">
-                  <wp14:pctHeight>20000</wp14:pctHeight>
+                  <wp14:pctHeight>0</wp14:pctHeight>
                 </wp14:sizeRelV>
               </wp:anchor>
             </w:drawing>
           </mc:Choice>
           <mc:Fallback>
             <w:pict>
-              <v:shapetype w14:anchorId="556DC657" id="_x0000_t202" coordsize="21600,21600" o:spt="202" path="m,l,21600r21600,l21600,xe">
+              <v:shapetype w14:anchorId="6A688D95" id="_x0000_t202" coordsize="21600,21600" o:spt="202" path="m,l,21600r21600,l21600,xe">
                 <v:stroke joinstyle="miter"/>
                 <v:path gradientshapeok="t" o:connecttype="rect"/>
               </v:shapetype>
-              <v:shape id="กล่องข้อความ 2" o:spid="_x0000_s1026" type="#_x0000_t202" style="position:absolute;margin-left:436.85pt;margin-top:17.85pt;width:306.9pt;height:476.35pt;z-index:251659264;visibility:visible;mso-wrap-style:square;mso-width-percent:400;mso-height-percent:200;mso-wrap-distance-left:9pt;mso-wrap-distance-top:3.6pt;mso-wrap-distance-right:9pt;mso-wrap-distance-bottom:3.6pt;mso-position-horizontal:absolute;mso-position-horizontal-relative:margin;mso-position-vertical:absolute;mso-position-vertical-relative:text;mso-width-percent:400;mso-height-percent:200;mso-width-relative:margin;mso-height-relative:margin;v-text-anchor:top" o:gfxdata="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" filled="f">
-                <v:textbox style="mso-fit-shape-to-text:t">
+              <v:shape id="กล่องข้อความ 2" o:spid="_x0000_s1026" type="#_x0000_t202" style="position:absolute;margin-left:437.1pt;margin-top:.35pt;width:306.9pt;height:502.4pt;z-index:251659264;visibility:visible;mso-wrap-style:square;mso-width-percent:400;mso-height-percent:0;mso-wrap-distance-left:9pt;mso-wrap-distance-top:3.6pt;mso-wrap-distance-right:9pt;mso-wrap-distance-bottom:3.6pt;mso-position-horizontal:absolute;mso-position-horizontal-relative:margin;mso-position-vertical:absolute;mso-position-vertical-relative:text;mso-width-percent:400;mso-height-percent:0;mso-width-relative:margin;mso-height-relative:margin;v-text-anchor:top" o:gfxdata="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" filled="f">
+                <v:textbox>
                   <w:txbxContent>
                     <w:p>
+                      <w:pPr>
+                        <w:jc w:val="center"/>
+                        <w:rPr>
+                          <w:rFonts w:ascii="TH SarabunPSK" w:hAnsi="TH SarabunPSK" w:cs="TH SarabunPSK"/>
+                          <w:b/>
+                          <w:bCs/>
+                          <w:sz w:val="32"/>
+                          <w:szCs w:val="32"/>
+                          <w:u w:val="single"/>
+                        </w:rPr>
+                      </w:pPr>
                       <w:r>
                         <w:rPr>
                           <w:rFonts w:ascii="TH SarabunPSK" w:hAnsi="TH SarabunPSK" w:cs="TH SarabunPSK"/>
-                          <w:sz w:val="28"/>
-                          <w:szCs w:val="28"/>
-                        </w:rPr>
-                        <w:t>{Discharge_Advice}</w:t>
+                          <w:b/>
+                          <w:bCs/>
+                          <w:sz w:val="32"/>
+                          <w:szCs w:val="32"/>
+                          <w:u w:val="single"/>
+                          <w:cs/>
+                        </w:rPr>
+                        <w:t>คำแนะนำการดูแลตนเองและข้อควรปฏิบัติ</w:t>
                       </w:r>
+                    </w:p>
+                    <w:p>
+                      <w:pPr>
+                        <w:rPr>
+                          <w:rFonts w:ascii="TH SarabunPSK" w:hAnsi="TH SarabunPSK" w:cs="TH SarabunPSK"/>
+                          <w:sz w:val="28"/>
+                        </w:rPr>
+                      </w:pPr>
+                      <w:r>
+                        <w:rPr>
+                          <w:rFonts w:ascii="Apple Color Emoji" w:hAnsi="Apple Color Emoji" w:cs="Apple Color Emoji"/>
+                          <w:sz w:val="28"/>
+                        </w:rPr>
+                        <w:t>🩺</w:t>
+                      </w:r>
+                      <w:r>
+                        <w:rPr>
+                          <w:rFonts w:ascii="TH SarabunPSK" w:hAnsi="TH SarabunPSK" w:cs="TH SarabunPSK"/>
+                          <w:sz w:val="28"/>
+                        </w:rPr>
+                        <w:t xml:space="preserve"> </w:t>
+                      </w:r>
+                      <w:r>
+                        <w:rPr>
+                          <w:rFonts w:ascii="TH SarabunPSK" w:hAnsi="TH SarabunPSK" w:cs="TH SarabunPSK"/>
+                          <w:sz w:val="28"/>
+                          <w:cs/>
+                        </w:rPr>
+                        <w:t>วันนี้เป็นอะไร (การวินิจฉัย):</w:t>
+                      </w:r>
+                    </w:p>
+                    <w:p>
+                      <w:pPr>
+                        <w:pStyle w:val="ListParagraph"/>
+                        <w:numPr>
+                          <w:ilvl w:val="0"/>
+                          <w:numId w:val="8"/>
+                        </w:numPr>
+                        <w:rPr>
+                          <w:rFonts w:ascii="TH SarabunPSK" w:hAnsi="TH SarabunPSK" w:cs="TH SarabunPSK"/>
+                          <w:sz w:val="28"/>
+                        </w:rPr>
+                      </w:pPr>
+                      <w:r>
+                        <w:rPr>
+                          <w:rFonts w:ascii="TH SarabunPSK" w:hAnsi="TH SarabunPSK" w:cs="TH SarabunPSK"/>
+                          <w:sz w:val="28"/>
+                        </w:rPr>
+                        <w:t>{</w:t>
+                      </w:r>
+                      <w:proofErr w:type="spellStart"/>
+                      <w:r>
+                        <w:rPr>
+                          <w:rFonts w:ascii="TH SarabunPSK" w:hAnsi="TH SarabunPSK" w:cs="TH SarabunPSK"/>
+                          <w:sz w:val="28"/>
+                        </w:rPr>
+                        <w:t>Advice_Dx</w:t>
+                      </w:r>
+                      <w:proofErr w:type="spellEnd"/>
+                      <w:r>
+                        <w:rPr>
+                          <w:rFonts w:ascii="TH SarabunPSK" w:hAnsi="TH SarabunPSK" w:cs="TH SarabunPSK"/>
+                          <w:sz w:val="28"/>
+                        </w:rPr>
+                        <w:t>}</w:t>
+                      </w:r>
+                    </w:p>
+                    <w:p>
+                      <w:pPr>
+                        <w:rPr>
+                          <w:rFonts w:ascii="TH SarabunPSK" w:hAnsi="TH SarabunPSK" w:cs="TH SarabunPSK"/>
+                          <w:sz w:val="28"/>
+                        </w:rPr>
+                      </w:pPr>
+                      <w:r>
+                        <w:rPr>
+                          <w:rFonts w:ascii="Apple Color Emoji" w:hAnsi="Apple Color Emoji" w:cs="Apple Color Emoji"/>
+                          <w:sz w:val="28"/>
+                        </w:rPr>
+                        <w:t>💉</w:t>
+                      </w:r>
+                      <w:r>
+                        <w:rPr>
+                          <w:rFonts w:ascii="TH SarabunPSK" w:hAnsi="TH SarabunPSK" w:cs="TH SarabunPSK"/>
+                          <w:sz w:val="28"/>
+                        </w:rPr>
+                        <w:t xml:space="preserve"> </w:t>
+                      </w:r>
+                      <w:r>
+                        <w:rPr>
+                          <w:rFonts w:ascii="TH SarabunPSK" w:hAnsi="TH SarabunPSK" w:cs="TH SarabunPSK"/>
+                          <w:sz w:val="28"/>
+                          <w:cs/>
+                        </w:rPr>
+                        <w:t>การรักษาที่ได้รับไปแล้ว:</w:t>
+                      </w:r>
+                    </w:p>
+                    <w:p>
+                      <w:pPr>
+                        <w:pStyle w:val="ListParagraph"/>
+                        <w:numPr>
+                          <w:ilvl w:val="0"/>
+                          <w:numId w:val="7"/>
+                        </w:numPr>
+                        <w:rPr>
+                          <w:rFonts w:ascii="TH SarabunPSK" w:hAnsi="TH SarabunPSK" w:cs="TH SarabunPSK"/>
+                          <w:sz w:val="28"/>
+                        </w:rPr>
+                      </w:pPr>
+                      <w:r>
+                        <w:rPr>
+                          <w:rFonts w:ascii="TH SarabunPSK" w:hAnsi="TH SarabunPSK" w:cs="TH SarabunPSK"/>
+                          <w:sz w:val="28"/>
+                        </w:rPr>
+                        <w:t>{</w:t>
+                      </w:r>
+                      <w:proofErr w:type="spellStart"/>
+                      <w:r>
+                        <w:rPr>
+                          <w:rFonts w:ascii="TH SarabunPSK" w:hAnsi="TH SarabunPSK" w:cs="TH SarabunPSK"/>
+                          <w:sz w:val="28"/>
+                        </w:rPr>
+                        <w:t>Advice_Tx</w:t>
+                      </w:r>
+                      <w:proofErr w:type="spellEnd"/>
+                      <w:r>
+                        <w:rPr>
+                          <w:rFonts w:ascii="TH SarabunPSK" w:hAnsi="TH SarabunPSK" w:cs="TH SarabunPSK"/>
+                          <w:sz w:val="28"/>
+                        </w:rPr>
+                        <w:t>}</w:t>
+                      </w:r>
+                    </w:p>
+                    <w:p>
+                      <w:pPr>
+                        <w:rPr>
+                          <w:rFonts w:ascii="TH SarabunPSK" w:hAnsi="TH SarabunPSK" w:cs="TH SarabunPSK"/>
+                          <w:sz w:val="28"/>
+                        </w:rPr>
+                      </w:pPr>
+                      <w:r>
+                        <w:rPr>
+                          <w:rFonts w:ascii="Apple Color Emoji" w:hAnsi="Apple Color Emoji" w:cs="Apple Color Emoji"/>
+                          <w:sz w:val="28"/>
+                        </w:rPr>
+                        <w:t>🏠</w:t>
+                      </w:r>
+                      <w:r>
+                        <w:rPr>
+                          <w:rFonts w:ascii="TH SarabunPSK" w:hAnsi="TH SarabunPSK" w:cs="TH SarabunPSK"/>
+                          <w:sz w:val="28"/>
+                        </w:rPr>
+                        <w:t xml:space="preserve"> </w:t>
+                      </w:r>
+                      <w:r>
+                        <w:rPr>
+                          <w:rFonts w:ascii="TH SarabunPSK" w:hAnsi="TH SarabunPSK" w:cs="TH SarabunPSK"/>
+                          <w:sz w:val="28"/>
+                          <w:cs/>
+                        </w:rPr>
+                        <w:t>ให้ทำอย่างไรต่อเมื่อกลับบ้าน:</w:t>
+                      </w:r>
+                    </w:p>
+                    <w:p>
+                      <w:pPr>
+                        <w:pStyle w:val="ListParagraph"/>
+                        <w:numPr>
+                          <w:ilvl w:val="0"/>
+                          <w:numId w:val="7"/>
+                        </w:numPr>
+                        <w:rPr>
+                          <w:rFonts w:ascii="TH SarabunPSK" w:hAnsi="TH SarabunPSK" w:cs="TH SarabunPSK"/>
+                          <w:sz w:val="28"/>
+                        </w:rPr>
+                      </w:pPr>
+                      <w:r>
+                        <w:rPr>
+                          <w:rFonts w:ascii="TH SarabunPSK" w:hAnsi="TH SarabunPSK" w:cs="TH SarabunPSK"/>
+                          <w:sz w:val="28"/>
+                        </w:rPr>
+                        <w:t>{</w:t>
+                      </w:r>
+                      <w:proofErr w:type="spellStart"/>
+                      <w:r>
+                        <w:rPr>
+                          <w:rFonts w:ascii="TH SarabunPSK" w:hAnsi="TH SarabunPSK" w:cs="TH SarabunPSK"/>
+                          <w:sz w:val="28"/>
+                        </w:rPr>
+                        <w:t>Advice_Home</w:t>
+                      </w:r>
+                      <w:proofErr w:type="spellEnd"/>
+                      <w:r>
+                        <w:rPr>
+                          <w:rFonts w:ascii="TH SarabunPSK" w:hAnsi="TH SarabunPSK" w:cs="TH SarabunPSK"/>
+                          <w:sz w:val="28"/>
+                        </w:rPr>
+                        <w:t>}</w:t>
+                      </w:r>
+                    </w:p>
+                    <w:p>
+                      <w:pPr>
+                        <w:rPr>
+                          <w:rFonts w:ascii="TH SarabunPSK" w:hAnsi="TH SarabunPSK" w:cs="TH SarabunPSK"/>
+                          <w:sz w:val="28"/>
+                        </w:rPr>
+                      </w:pPr>
+                      <w:r>
+                        <w:rPr>
+                          <w:rFonts w:ascii="Apple Color Emoji" w:hAnsi="Apple Color Emoji" w:cs="Apple Color Emoji"/>
+                          <w:sz w:val="28"/>
+                        </w:rPr>
+                        <w:t>🚨</w:t>
+                      </w:r>
+                      <w:r>
+                        <w:rPr>
+                          <w:rFonts w:ascii="TH SarabunPSK" w:hAnsi="TH SarabunPSK" w:cs="TH SarabunPSK"/>
+                          <w:sz w:val="28"/>
+                        </w:rPr>
+                        <w:t xml:space="preserve"> </w:t>
+                      </w:r>
+                      <w:r>
+                        <w:rPr>
+                          <w:rFonts w:ascii="TH SarabunPSK" w:hAnsi="TH SarabunPSK" w:cs="TH SarabunPSK"/>
+                          <w:sz w:val="28"/>
+                          <w:cs/>
+                        </w:rPr>
+                        <w:t>อาการอันตรายที่ต้องรีบกลับมาพบแพทย์ทันที:</w:t>
+                      </w:r>
+                    </w:p>
+                    <w:p>
+                      <w:pPr>
+                        <w:pStyle w:val="ListParagraph"/>
+                        <w:numPr>
+                          <w:ilvl w:val="0"/>
+                          <w:numId w:val="7"/>
+                        </w:numPr>
+                        <w:rPr>
+                          <w:sz w:val="28"/>
+                        </w:rPr>
+                      </w:pPr>
+                      <w:r>
+                        <w:rPr>
+                          <w:rFonts w:ascii="TH SarabunPSK" w:hAnsi="TH SarabunPSK" w:cs="TH SarabunPSK"/>
+                          <w:sz w:val="28"/>
+                        </w:rPr>
+                        <w:t>{</w:t>
+                      </w:r>
+                      <w:proofErr w:type="spellStart"/>
+                      <w:r>
+                        <w:rPr>
+                          <w:rFonts w:ascii="TH SarabunPSK" w:hAnsi="TH SarabunPSK" w:cs="TH SarabunPSK"/>
+                          <w:sz w:val="28"/>
+                        </w:rPr>
+                        <w:t>Advice_RedFlags</w:t>
+                      </w:r>
+                      <w:proofErr w:type="spellEnd"/>
+                      <w:r>
+                        <w:rPr>
+                          <w:rFonts w:ascii="TH SarabunPSK" w:hAnsi="TH SarabunPSK" w:cs="TH SarabunPSK"/>
+                          <w:sz w:val="28"/>
+                        </w:rPr>
+                        <w:t>}</w:t>
+                      </w:r>
+                    </w:p>
+                    <w:p>
+                      <w:pPr>
+                        <w:ind w:left="360"/>
+                      </w:pPr>
                     </w:p>
                   </w:txbxContent>
                 </v:textbox>
@@ -143,7 +709,7 @@
 </file>
 
 <file path=word/numbering.xml><?xml version="1.0" encoding="utf-8"?>
-<w:numbering xmlns:wpc="http://schemas.microsoft.com/office/word/2010/wordprocessingCanvas" xmlns:cx="http://schemas.microsoft.com/office/drawing/2014/chartex" xmlns:cx1="http://schemas.microsoft.com/office/drawing/2015/9/8/chartex" xmlns:cx2="http://schemas.microsoft.com/office/drawing/2015/10/21/chartex" xmlns:cx3="http://schemas.microsoft.com/office/drawing/2016/5/9/chartex" xmlns:cx4="http://schemas.microsoft.com/office/drawing/2016/5/10/chartex" xmlns:cx5="http://schemas.microsoft.com/office/drawing/2016/5/11/chartex" xmlns:cx6="http://schemas.microsoft.com/office/drawing/2016/5/12/chartex" xmlns:cx7="http://schemas.microsoft.com/office/drawing/2016/5/13/chartex" xmlns:cx8="http://schemas.microsoft.com/office/drawing/2016/5/14/chartex" xmlns:mc="http://schemas.openxmlformats.org/markup-compatibility/2006" xmlns:aink="http://schemas.microsoft.com/office/drawing/2016/ink" xmlns:am3d="http://schemas.microsoft.com/office/drawing/2017/model3d" xmlns:o="urn:schemas-microsoft-com:office:office" xmlns:oel="http://schemas.microsoft.com/office/2019/extlst" xmlns:r="http://schemas.openxmlformats.org/officeDocument/2006/relationships" xmlns:m="http://schemas.openxmlformats.org/officeDocument/2006/math" xmlns:v="urn:schemas-microsoft-com:vml" xmlns:wp14="http://schemas.microsoft.com/office/word/2010/wordprocessingDrawing" xmlns:wp="http://schemas.openxmlformats.org/drawingml/2006/wordprocessingDrawing" xmlns:w10="urn:schemas-microsoft-com:office:word" xmlns:w="http://schemas.openxmlformats.org/wordprocessingml/2006/main" xmlns:w14="http://schemas.microsoft.com/office/word/2010/wordml" xmlns:w15="http://schemas.microsoft.com/office/word/2012/wordml" xmlns:w16cex="http://schemas.microsoft.com/office/word/2018/wordml/cex" xmlns:w16cid="http://schemas.microsoft.com/office/word/2016/wordml/cid" xmlns:w16="http://schemas.microsoft.com/office/word/2018/wordml" xmlns:w16du="http://schemas.microsoft.com/office/word/2023/wordml/word16du" xmlns:w16sdtdh="http://schemas.microsoft.com/office/word/2020/wordml/sdtdatahash" xmlns:w16sdtfl="http://schemas.microsoft.com/office/word/2024/wordml/sdtformatlock" xmlns:w16se="http://schemas.microsoft.com/office/word/2015/wordml/symex" xmlns:wpg="http://schemas.microsoft.com/office/word/2010/wordprocessingGroup" xmlns:wpi="http://schemas.microsoft.com/office/word/2010/wordprocessingInk" xmlns:wne="http://schemas.microsoft.com/office/word/2006/wordml" xmlns:wps="http://schemas.microsoft.com/office/word/2010/wordprocessingShape" mc:Ignorable="w14 w15 w16se w16cid w16 w16cex w16sdtdh w16sdtfl w16du wp14">
+<w:numbering xmlns:wpc="http://schemas.microsoft.com/office/word/2010/wordprocessingCanvas" xmlns:cx="http://schemas.microsoft.com/office/drawing/2014/chartex" xmlns:cx1="http://schemas.microsoft.com/office/drawing/2015/9/8/chartex" xmlns:cx2="http://schemas.microsoft.com/office/drawing/2015/10/21/chartex" xmlns:cx3="http://schemas.microsoft.com/office/drawing/2016/5/9/chartex" xmlns:cx4="http://schemas.microsoft.com/office/drawing/2016/5/10/chartex" xmlns:cx5="http://schemas.microsoft.com/office/drawing/2016/5/11/chartex" xmlns:cx6="http://schemas.microsoft.com/office/drawing/2016/5/12/chartex" xmlns:cx7="http://schemas.microsoft.com/office/drawing/2016/5/13/chartex" xmlns:cx8="http://schemas.microsoft.com/office/drawing/2016/5/14/chartex" xmlns:mc="http://schemas.openxmlformats.org/markup-compatibility/2006" xmlns:aink="http://schemas.microsoft.com/office/drawing/2016/ink" xmlns:am3d="http://schemas.microsoft.com/office/drawing/2017/model3d" xmlns:o="urn:schemas-microsoft-com:office:office" xmlns:r="http://schemas.openxmlformats.org/officeDocument/2006/relationships" xmlns:m="http://schemas.openxmlformats.org/officeDocument/2006/math" xmlns:v="urn:schemas-microsoft-com:vml" xmlns:wp14="http://schemas.microsoft.com/office/word/2010/wordprocessingDrawing" xmlns:wp="http://schemas.openxmlformats.org/drawingml/2006/wordprocessingDrawing" xmlns:w10="urn:schemas-microsoft-com:office:word" xmlns:w="http://schemas.openxmlformats.org/wordprocessingml/2006/main" xmlns:w14="http://schemas.microsoft.com/office/word/2010/wordml" xmlns:w15="http://schemas.microsoft.com/office/word/2012/wordml" xmlns:w16cex="http://schemas.microsoft.com/office/word/2018/wordml/cex" xmlns:w16cid="http://schemas.microsoft.com/office/word/2016/wordml/cid" xmlns:w16="http://schemas.microsoft.com/office/word/2018/wordml" xmlns:w16sdtdh="http://schemas.microsoft.com/office/word/2020/wordml/sdtdatahash" xmlns:w16se="http://schemas.microsoft.com/office/word/2015/wordml/symex" xmlns:wpg="http://schemas.microsoft.com/office/word/2010/wordprocessingGroup" xmlns:wpi="http://schemas.microsoft.com/office/word/2010/wordprocessingInk" xmlns:wne="http://schemas.microsoft.com/office/word/2006/wordml" xmlns:wps="http://schemas.microsoft.com/office/word/2010/wordprocessingShape" mc:Ignorable="w14 w15 w16se w16cid w16 w16cex w16sdtdh wp14">
   <w:abstractNum w:abstractNumId="0" w15:restartNumberingAfterBreak="0">
     <w:nsid w:val="1061186C"/>
     <w:multiLevelType w:val="hybridMultilevel"/>
@@ -257,6 +823,119 @@
     </w:lvl>
   </w:abstractNum>
   <w:abstractNum w:abstractNumId="1" w15:restartNumberingAfterBreak="0">
+    <w:nsid w:val="12185E40"/>
+    <w:multiLevelType w:val="hybridMultilevel"/>
+    <w:tmpl w:val="0FE07944"/>
+    <w:lvl w:ilvl="0" w:tplc="04090001">
+      <w:start w:val="1"/>
+      <w:numFmt w:val="bullet"/>
+      <w:lvlText w:val=""/>
+      <w:lvlJc w:val="left"/>
+      <w:pPr>
+        <w:ind w:left="720" w:hanging="360"/>
+      </w:pPr>
+      <w:rPr>
+        <w:rFonts w:ascii="Symbol" w:hAnsi="Symbol" w:hint="default"/>
+      </w:rPr>
+    </w:lvl>
+    <w:lvl w:ilvl="1" w:tplc="04090003" w:tentative="1">
+      <w:start w:val="1"/>
+      <w:numFmt w:val="bullet"/>
+      <w:lvlText w:val="o"/>
+      <w:lvlJc w:val="left"/>
+      <w:pPr>
+        <w:ind w:left="1440" w:hanging="360"/>
+      </w:pPr>
+      <w:rPr>
+        <w:rFonts w:ascii="Courier New" w:hAnsi="Courier New" w:cs="Courier New" w:hint="default"/>
+      </w:rPr>
+    </w:lvl>
+    <w:lvl w:ilvl="2" w:tplc="04090005" w:tentative="1">
+      <w:start w:val="1"/>
+      <w:numFmt w:val="bullet"/>
+      <w:lvlText w:val=""/>
+      <w:lvlJc w:val="left"/>
+      <w:pPr>
+        <w:ind w:left="2160" w:hanging="360"/>
+      </w:pPr>
+      <w:rPr>
+        <w:rFonts w:ascii="Wingdings" w:hAnsi="Wingdings" w:hint="default"/>
+      </w:rPr>
+    </w:lvl>
+    <w:lvl w:ilvl="3" w:tplc="04090001" w:tentative="1">
+      <w:start w:val="1"/>
+      <w:numFmt w:val="bullet"/>
+      <w:lvlText w:val=""/>
+      <w:lvlJc w:val="left"/>
+      <w:pPr>
+        <w:ind w:left="2880" w:hanging="360"/>
+      </w:pPr>
+      <w:rPr>
+        <w:rFonts w:ascii="Symbol" w:hAnsi="Symbol" w:hint="default"/>
+      </w:rPr>
+    </w:lvl>
+    <w:lvl w:ilvl="4" w:tplc="04090003" w:tentative="1">
+      <w:start w:val="1"/>
+      <w:numFmt w:val="bullet"/>
+      <w:lvlText w:val="o"/>
+      <w:lvlJc w:val="left"/>
+      <w:pPr>
+        <w:ind w:left="3600" w:hanging="360"/>
+      </w:pPr>
+      <w:rPr>
+        <w:rFonts w:ascii="Courier New" w:hAnsi="Courier New" w:cs="Courier New" w:hint="default"/>
+      </w:rPr>
+    </w:lvl>
+    <w:lvl w:ilvl="5" w:tplc="04090005" w:tentative="1">
+      <w:start w:val="1"/>
+      <w:numFmt w:val="bullet"/>
+      <w:lvlText w:val=""/>
+      <w:lvlJc w:val="left"/>
+      <w:pPr>
+        <w:ind w:left="4320" w:hanging="360"/>
+      </w:pPr>
+      <w:rPr>
+        <w:rFonts w:ascii="Wingdings" w:hAnsi="Wingdings" w:hint="default"/>
+      </w:rPr>
+    </w:lvl>
+    <w:lvl w:ilvl="6" w:tplc="04090001" w:tentative="1">
+      <w:start w:val="1"/>
+      <w:numFmt w:val="bullet"/>
+      <w:lvlText w:val=""/>
+      <w:lvlJc w:val="left"/>
+      <w:pPr>
+        <w:ind w:left="5040" w:hanging="360"/>
+      </w:pPr>
+      <w:rPr>
+        <w:rFonts w:ascii="Symbol" w:hAnsi="Symbol" w:hint="default"/>
+      </w:rPr>
+    </w:lvl>
+    <w:lvl w:ilvl="7" w:tplc="04090003" w:tentative="1">
+      <w:start w:val="1"/>
+      <w:numFmt w:val="bullet"/>
+      <w:lvlText w:val="o"/>
+      <w:lvlJc w:val="left"/>
+      <w:pPr>
+        <w:ind w:left="5760" w:hanging="360"/>
+      </w:pPr>
+      <w:rPr>
+        <w:rFonts w:ascii="Courier New" w:hAnsi="Courier New" w:cs="Courier New" w:hint="default"/>
+      </w:rPr>
+    </w:lvl>
+    <w:lvl w:ilvl="8" w:tplc="04090005" w:tentative="1">
+      <w:start w:val="1"/>
+      <w:numFmt w:val="bullet"/>
+      <w:lvlText w:val=""/>
+      <w:lvlJc w:val="left"/>
+      <w:pPr>
+        <w:ind w:left="6480" w:hanging="360"/>
+      </w:pPr>
+      <w:rPr>
+        <w:rFonts w:ascii="Wingdings" w:hAnsi="Wingdings" w:hint="default"/>
+      </w:rPr>
+    </w:lvl>
+  </w:abstractNum>
+  <w:abstractNum w:abstractNumId="2" w15:restartNumberingAfterBreak="0">
     <w:nsid w:val="2007681A"/>
     <w:multiLevelType w:val="hybridMultilevel"/>
     <w:tmpl w:val="BD88C290"/>
@@ -368,7 +1047,7 @@
       </w:rPr>
     </w:lvl>
   </w:abstractNum>
-  <w:abstractNum w:abstractNumId="2" w15:restartNumberingAfterBreak="0">
+  <w:abstractNum w:abstractNumId="3" w15:restartNumberingAfterBreak="0">
     <w:nsid w:val="562C30E2"/>
     <w:multiLevelType w:val="hybridMultilevel"/>
     <w:tmpl w:val="0ADE5BCE"/>
@@ -480,7 +1159,7 @@
       </w:rPr>
     </w:lvl>
   </w:abstractNum>
-  <w:abstractNum w:abstractNumId="3" w15:restartNumberingAfterBreak="0">
+  <w:abstractNum w:abstractNumId="4" w15:restartNumberingAfterBreak="0">
     <w:nsid w:val="5960754C"/>
     <w:multiLevelType w:val="hybridMultilevel"/>
     <w:tmpl w:val="823821F6"/>
@@ -593,7 +1272,7 @@
       </w:rPr>
     </w:lvl>
   </w:abstractNum>
-  <w:abstractNum w:abstractNumId="4" w15:restartNumberingAfterBreak="0">
+  <w:abstractNum w:abstractNumId="5" w15:restartNumberingAfterBreak="0">
     <w:nsid w:val="5FE529D6"/>
     <w:multiLevelType w:val="hybridMultilevel"/>
     <w:tmpl w:val="6D6E7CB0"/>
@@ -705,7 +1384,7 @@
       </w:rPr>
     </w:lvl>
   </w:abstractNum>
-  <w:abstractNum w:abstractNumId="5" w15:restartNumberingAfterBreak="0">
+  <w:abstractNum w:abstractNumId="6" w15:restartNumberingAfterBreak="0">
     <w:nsid w:val="605B4A7E"/>
     <w:multiLevelType w:val="hybridMultilevel"/>
     <w:tmpl w:val="6518C73A"/>
@@ -817,29 +1496,148 @@
       </w:rPr>
     </w:lvl>
   </w:abstractNum>
-  <w:num w:numId="1" w16cid:durableId="698699209">
+  <w:abstractNum w:abstractNumId="7" w15:restartNumberingAfterBreak="0">
+    <w:nsid w:val="666914A7"/>
+    <w:multiLevelType w:val="hybridMultilevel"/>
+    <w:tmpl w:val="2CD41468"/>
+    <w:lvl w:ilvl="0" w:tplc="04090001">
+      <w:start w:val="1"/>
+      <w:numFmt w:val="bullet"/>
+      <w:lvlText w:val=""/>
+      <w:lvlJc w:val="left"/>
+      <w:pPr>
+        <w:ind w:left="720" w:hanging="360"/>
+      </w:pPr>
+      <w:rPr>
+        <w:rFonts w:ascii="Symbol" w:hAnsi="Symbol" w:hint="default"/>
+      </w:rPr>
+    </w:lvl>
+    <w:lvl w:ilvl="1" w:tplc="04090003" w:tentative="1">
+      <w:start w:val="1"/>
+      <w:numFmt w:val="bullet"/>
+      <w:lvlText w:val="o"/>
+      <w:lvlJc w:val="left"/>
+      <w:pPr>
+        <w:ind w:left="1440" w:hanging="360"/>
+      </w:pPr>
+      <w:rPr>
+        <w:rFonts w:ascii="Courier New" w:hAnsi="Courier New" w:cs="Courier New" w:hint="default"/>
+      </w:rPr>
+    </w:lvl>
+    <w:lvl w:ilvl="2" w:tplc="04090005" w:tentative="1">
+      <w:start w:val="1"/>
+      <w:numFmt w:val="bullet"/>
+      <w:lvlText w:val=""/>
+      <w:lvlJc w:val="left"/>
+      <w:pPr>
+        <w:ind w:left="2160" w:hanging="360"/>
+      </w:pPr>
+      <w:rPr>
+        <w:rFonts w:ascii="Wingdings" w:hAnsi="Wingdings" w:hint="default"/>
+      </w:rPr>
+    </w:lvl>
+    <w:lvl w:ilvl="3" w:tplc="04090001" w:tentative="1">
+      <w:start w:val="1"/>
+      <w:numFmt w:val="bullet"/>
+      <w:lvlText w:val=""/>
+      <w:lvlJc w:val="left"/>
+      <w:pPr>
+        <w:ind w:left="2880" w:hanging="360"/>
+      </w:pPr>
+      <w:rPr>
+        <w:rFonts w:ascii="Symbol" w:hAnsi="Symbol" w:hint="default"/>
+      </w:rPr>
+    </w:lvl>
+    <w:lvl w:ilvl="4" w:tplc="04090003" w:tentative="1">
+      <w:start w:val="1"/>
+      <w:numFmt w:val="bullet"/>
+      <w:lvlText w:val="o"/>
+      <w:lvlJc w:val="left"/>
+      <w:pPr>
+        <w:ind w:left="3600" w:hanging="360"/>
+      </w:pPr>
+      <w:rPr>
+        <w:rFonts w:ascii="Courier New" w:hAnsi="Courier New" w:cs="Courier New" w:hint="default"/>
+      </w:rPr>
+    </w:lvl>
+    <w:lvl w:ilvl="5" w:tplc="04090005" w:tentative="1">
+      <w:start w:val="1"/>
+      <w:numFmt w:val="bullet"/>
+      <w:lvlText w:val=""/>
+      <w:lvlJc w:val="left"/>
+      <w:pPr>
+        <w:ind w:left="4320" w:hanging="360"/>
+      </w:pPr>
+      <w:rPr>
+        <w:rFonts w:ascii="Wingdings" w:hAnsi="Wingdings" w:hint="default"/>
+      </w:rPr>
+    </w:lvl>
+    <w:lvl w:ilvl="6" w:tplc="04090001" w:tentative="1">
+      <w:start w:val="1"/>
+      <w:numFmt w:val="bullet"/>
+      <w:lvlText w:val=""/>
+      <w:lvlJc w:val="left"/>
+      <w:pPr>
+        <w:ind w:left="5040" w:hanging="360"/>
+      </w:pPr>
+      <w:rPr>
+        <w:rFonts w:ascii="Symbol" w:hAnsi="Symbol" w:hint="default"/>
+      </w:rPr>
+    </w:lvl>
+    <w:lvl w:ilvl="7" w:tplc="04090003" w:tentative="1">
+      <w:start w:val="1"/>
+      <w:numFmt w:val="bullet"/>
+      <w:lvlText w:val="o"/>
+      <w:lvlJc w:val="left"/>
+      <w:pPr>
+        <w:ind w:left="5760" w:hanging="360"/>
+      </w:pPr>
+      <w:rPr>
+        <w:rFonts w:ascii="Courier New" w:hAnsi="Courier New" w:cs="Courier New" w:hint="default"/>
+      </w:rPr>
+    </w:lvl>
+    <w:lvl w:ilvl="8" w:tplc="04090005" w:tentative="1">
+      <w:start w:val="1"/>
+      <w:numFmt w:val="bullet"/>
+      <w:lvlText w:val=""/>
+      <w:lvlJc w:val="left"/>
+      <w:pPr>
+        <w:ind w:left="6480" w:hanging="360"/>
+      </w:pPr>
+      <w:rPr>
+        <w:rFonts w:ascii="Wingdings" w:hAnsi="Wingdings" w:hint="default"/>
+      </w:rPr>
+    </w:lvl>
+  </w:abstractNum>
+  <w:num w:numId="1">
+    <w:abstractNumId w:val="4"/>
+  </w:num>
+  <w:num w:numId="2">
+    <w:abstractNumId w:val="6"/>
+  </w:num>
+  <w:num w:numId="3">
+    <w:abstractNumId w:val="5"/>
+  </w:num>
+  <w:num w:numId="4">
     <w:abstractNumId w:val="3"/>
   </w:num>
-  <w:num w:numId="2" w16cid:durableId="1592398935">
-    <w:abstractNumId w:val="5"/>
+  <w:num w:numId="5">
+    <w:abstractNumId w:val="0"/>
   </w:num>
-  <w:num w:numId="3" w16cid:durableId="1846624986">
-    <w:abstractNumId w:val="4"/>
-  </w:num>
-  <w:num w:numId="4" w16cid:durableId="1060396083">
+  <w:num w:numId="6">
     <w:abstractNumId w:val="2"/>
   </w:num>
-  <w:num w:numId="5" w16cid:durableId="1996255773">
-    <w:abstractNumId w:val="0"/>
+  <w:num w:numId="7">
+    <w:abstractNumId w:val="7"/>
   </w:num>
-  <w:num w:numId="6" w16cid:durableId="1270316452">
+  <w:num w:numId="8">
     <w:abstractNumId w:val="1"/>
   </w:num>
 </w:numbering>
 </file>
 
 <file path=word/styles.xml><?xml version="1.0" encoding="utf-8"?>
-<w:styles xmlns:mc="http://schemas.openxmlformats.org/markup-compatibility/2006" xmlns:r="http://schemas.openxmlformats.org/officeDocument/2006/relationships" xmlns:w="http://schemas.openxmlformats.org/wordprocessingml/2006/main" xmlns:w14="http://schemas.microsoft.com/office/word/2010/wordml" xmlns:w15="http://schemas.microsoft.com/office/word/2012/wordml" xmlns:w16cex="http://schemas.microsoft.com/office/word/2018/wordml/cex" xmlns:w16cid="http://schemas.microsoft.com/office/word/2016/wordml/cid" xmlns:w16="http://schemas.microsoft.com/office/word/2018/wordml" xmlns:w16du="http://schemas.microsoft.com/office/word/2023/wordml/word16du" xmlns:w16sdtdh="http://schemas.microsoft.com/office/word/2020/wordml/sdtdatahash" xmlns:w16sdtfl="http://schemas.microsoft.com/office/word/2024/wordml/sdtformatlock" xmlns:w16se="http://schemas.microsoft.com/office/word/2015/wordml/symex" mc:Ignorable="w14 w15 w16se w16cid w16 w16cex w16sdtdh w16sdtfl w16du">
+<w:styles xmlns:mc="http://schemas.openxmlformats.org/markup-compatibility/2006" xmlns:r="http://schemas.openxmlformats.org/officeDocument/2006/relationships" xmlns:w="http://schemas.openxmlformats.org/wordprocessingml/2006/main" xmlns:w14="http://schemas.microsoft.com/office/word/2010/wordml" xmlns:w15="http://schemas.microsoft.com/office/word/2012/wordml" xmlns:w16cex="http://schemas.microsoft.com/office/word/2018/wordml/cex" xmlns:w16cid="http://schemas.microsoft.com/office/word/2016/wordml/cid" xmlns:w16="http://schemas.microsoft.com/office/word/2018/wordml" xmlns:w16sdtdh="http://schemas.microsoft.com/office/word/2020/wordml/sdtdatahash" xmlns:w16se="http://schemas.microsoft.com/office/word/2015/wordml/symex" mc:Ignorable="w14 w15 w16se w16cid w16 w16cex w16sdtdh">
   <w:docDefaults>
     <w:rPrDefault>
       <w:rPr>
@@ -1235,15 +2033,15 @@
     <w:lsdException w:name="Unresolved Mention" w:semiHidden="1" w:unhideWhenUsed="1"/>
     <w:lsdException w:name="Smart Link" w:semiHidden="1" w:unhideWhenUsed="1"/>
   </w:latentStyles>
-  <w:style w:type="paragraph" w:default="1" w:styleId="a">
+  <w:style w:type="paragraph" w:default="1" w:styleId="Normal">
     <w:name w:val="Normal"/>
     <w:qFormat/>
   </w:style>
-  <w:style w:type="paragraph" w:styleId="1">
+  <w:style w:type="paragraph" w:styleId="Heading1">
     <w:name w:val="heading 1"/>
-    <w:basedOn w:val="a"/>
-    <w:next w:val="a"/>
-    <w:link w:val="10"/>
+    <w:basedOn w:val="Normal"/>
+    <w:next w:val="Normal"/>
+    <w:link w:val="Heading1Char"/>
     <w:uiPriority w:val="9"/>
     <w:qFormat/>
     <w:rsid w:val="00006ED1"/>
@@ -1260,11 +2058,11 @@
       <w:szCs w:val="50"/>
     </w:rPr>
   </w:style>
-  <w:style w:type="paragraph" w:styleId="2">
+  <w:style w:type="paragraph" w:styleId="Heading2">
     <w:name w:val="heading 2"/>
-    <w:basedOn w:val="a"/>
-    <w:next w:val="a"/>
-    <w:link w:val="20"/>
+    <w:basedOn w:val="Normal"/>
+    <w:next w:val="Normal"/>
+    <w:link w:val="Heading2Char"/>
     <w:uiPriority w:val="9"/>
     <w:semiHidden/>
     <w:unhideWhenUsed/>
@@ -1283,11 +2081,11 @@
       <w:szCs w:val="40"/>
     </w:rPr>
   </w:style>
-  <w:style w:type="paragraph" w:styleId="3">
+  <w:style w:type="paragraph" w:styleId="Heading3">
     <w:name w:val="heading 3"/>
-    <w:basedOn w:val="a"/>
-    <w:next w:val="a"/>
-    <w:link w:val="30"/>
+    <w:basedOn w:val="Normal"/>
+    <w:next w:val="Normal"/>
+    <w:link w:val="Heading3Char"/>
     <w:uiPriority w:val="9"/>
     <w:semiHidden/>
     <w:unhideWhenUsed/>
@@ -1306,11 +2104,11 @@
       <w:szCs w:val="35"/>
     </w:rPr>
   </w:style>
-  <w:style w:type="paragraph" w:styleId="4">
+  <w:style w:type="paragraph" w:styleId="Heading4">
     <w:name w:val="heading 4"/>
-    <w:basedOn w:val="a"/>
-    <w:next w:val="a"/>
-    <w:link w:val="40"/>
+    <w:basedOn w:val="Normal"/>
+    <w:next w:val="Normal"/>
+    <w:link w:val="Heading4Char"/>
     <w:uiPriority w:val="9"/>
     <w:semiHidden/>
     <w:unhideWhenUsed/>
@@ -1329,11 +2127,11 @@
       <w:color w:val="2F5496" w:themeColor="accent1" w:themeShade="BF"/>
     </w:rPr>
   </w:style>
-  <w:style w:type="paragraph" w:styleId="5">
+  <w:style w:type="paragraph" w:styleId="Heading5">
     <w:name w:val="heading 5"/>
-    <w:basedOn w:val="a"/>
-    <w:next w:val="a"/>
-    <w:link w:val="50"/>
+    <w:basedOn w:val="Normal"/>
+    <w:next w:val="Normal"/>
+    <w:link w:val="Heading5Char"/>
     <w:uiPriority w:val="9"/>
     <w:semiHidden/>
     <w:unhideWhenUsed/>
@@ -1350,11 +2148,11 @@
       <w:color w:val="2F5496" w:themeColor="accent1" w:themeShade="BF"/>
     </w:rPr>
   </w:style>
-  <w:style w:type="paragraph" w:styleId="6">
+  <w:style w:type="paragraph" w:styleId="Heading6">
     <w:name w:val="heading 6"/>
-    <w:basedOn w:val="a"/>
-    <w:next w:val="a"/>
-    <w:link w:val="60"/>
+    <w:basedOn w:val="Normal"/>
+    <w:next w:val="Normal"/>
+    <w:link w:val="Heading6Char"/>
     <w:uiPriority w:val="9"/>
     <w:semiHidden/>
     <w:unhideWhenUsed/>
@@ -1373,11 +2171,11 @@
       <w:color w:val="595959" w:themeColor="text1" w:themeTint="A6"/>
     </w:rPr>
   </w:style>
-  <w:style w:type="paragraph" w:styleId="7">
+  <w:style w:type="paragraph" w:styleId="Heading7">
     <w:name w:val="heading 7"/>
-    <w:basedOn w:val="a"/>
-    <w:next w:val="a"/>
-    <w:link w:val="70"/>
+    <w:basedOn w:val="Normal"/>
+    <w:next w:val="Normal"/>
+    <w:link w:val="Heading7Char"/>
     <w:uiPriority w:val="9"/>
     <w:semiHidden/>
     <w:unhideWhenUsed/>
@@ -1394,11 +2192,11 @@
       <w:color w:val="595959" w:themeColor="text1" w:themeTint="A6"/>
     </w:rPr>
   </w:style>
-  <w:style w:type="paragraph" w:styleId="8">
+  <w:style w:type="paragraph" w:styleId="Heading8">
     <w:name w:val="heading 8"/>
-    <w:basedOn w:val="a"/>
-    <w:next w:val="a"/>
-    <w:link w:val="80"/>
+    <w:basedOn w:val="Normal"/>
+    <w:next w:val="Normal"/>
+    <w:link w:val="Heading8Char"/>
     <w:uiPriority w:val="9"/>
     <w:semiHidden/>
     <w:unhideWhenUsed/>
@@ -1417,11 +2215,11 @@
       <w:color w:val="272727" w:themeColor="text1" w:themeTint="D8"/>
     </w:rPr>
   </w:style>
-  <w:style w:type="paragraph" w:styleId="9">
+  <w:style w:type="paragraph" w:styleId="Heading9">
     <w:name w:val="heading 9"/>
-    <w:basedOn w:val="a"/>
-    <w:next w:val="a"/>
-    <w:link w:val="90"/>
+    <w:basedOn w:val="Normal"/>
+    <w:next w:val="Normal"/>
+    <w:link w:val="Heading9Char"/>
     <w:uiPriority w:val="9"/>
     <w:semiHidden/>
     <w:unhideWhenUsed/>
@@ -1438,13 +2236,13 @@
       <w:color w:val="272727" w:themeColor="text1" w:themeTint="D8"/>
     </w:rPr>
   </w:style>
-  <w:style w:type="character" w:default="1" w:styleId="a0">
+  <w:style w:type="character" w:default="1" w:styleId="DefaultParagraphFont">
     <w:name w:val="Default Paragraph Font"/>
     <w:uiPriority w:val="1"/>
     <w:semiHidden/>
     <w:unhideWhenUsed/>
   </w:style>
-  <w:style w:type="table" w:default="1" w:styleId="a1">
+  <w:style w:type="table" w:default="1" w:styleId="TableNormal">
     <w:name w:val="Normal Table"/>
     <w:uiPriority w:val="99"/>
     <w:semiHidden/>
@@ -1459,16 +2257,16 @@
       </w:tblCellMar>
     </w:tblPr>
   </w:style>
-  <w:style w:type="numbering" w:default="1" w:styleId="a2">
+  <w:style w:type="numbering" w:default="1" w:styleId="NoList">
     <w:name w:val="No List"/>
     <w:uiPriority w:val="99"/>
     <w:semiHidden/>
     <w:unhideWhenUsed/>
   </w:style>
-  <w:style w:type="character" w:customStyle="1" w:styleId="10">
-    <w:name w:val="หัวเรื่อง 1 อักขระ"/>
-    <w:basedOn w:val="a0"/>
-    <w:link w:val="1"/>
+  <w:style w:type="character" w:customStyle="1" w:styleId="Heading1Char">
+    <w:name w:val="Heading 1 Char"/>
+    <w:basedOn w:val="DefaultParagraphFont"/>
+    <w:link w:val="Heading1"/>
     <w:uiPriority w:val="9"/>
     <w:rsid w:val="00006ED1"/>
     <w:rPr>
@@ -1478,10 +2276,10 @@
       <w:szCs w:val="50"/>
     </w:rPr>
   </w:style>
-  <w:style w:type="character" w:customStyle="1" w:styleId="20">
-    <w:name w:val="หัวเรื่อง 2 อักขระ"/>
-    <w:basedOn w:val="a0"/>
-    <w:link w:val="2"/>
+  <w:style w:type="character" w:customStyle="1" w:styleId="Heading2Char">
+    <w:name w:val="Heading 2 Char"/>
+    <w:basedOn w:val="DefaultParagraphFont"/>
+    <w:link w:val="Heading2"/>
     <w:uiPriority w:val="9"/>
     <w:semiHidden/>
     <w:rsid w:val="00006ED1"/>
@@ -1492,10 +2290,10 @@
       <w:szCs w:val="40"/>
     </w:rPr>
   </w:style>
-  <w:style w:type="character" w:customStyle="1" w:styleId="30">
-    <w:name w:val="หัวเรื่อง 3 อักขระ"/>
-    <w:basedOn w:val="a0"/>
-    <w:link w:val="3"/>
+  <w:style w:type="character" w:customStyle="1" w:styleId="Heading3Char">
+    <w:name w:val="Heading 3 Char"/>
+    <w:basedOn w:val="DefaultParagraphFont"/>
+    <w:link w:val="Heading3"/>
     <w:uiPriority w:val="9"/>
     <w:semiHidden/>
     <w:rsid w:val="00006ED1"/>
@@ -1506,10 +2304,10 @@
       <w:szCs w:val="35"/>
     </w:rPr>
   </w:style>
-  <w:style w:type="character" w:customStyle="1" w:styleId="40">
-    <w:name w:val="หัวเรื่อง 4 อักขระ"/>
-    <w:basedOn w:val="a0"/>
-    <w:link w:val="4"/>
+  <w:style w:type="character" w:customStyle="1" w:styleId="Heading4Char">
+    <w:name w:val="Heading 4 Char"/>
+    <w:basedOn w:val="DefaultParagraphFont"/>
+    <w:link w:val="Heading4"/>
     <w:uiPriority w:val="9"/>
     <w:semiHidden/>
     <w:rsid w:val="00006ED1"/>
@@ -1520,10 +2318,10 @@
       <w:color w:val="2F5496" w:themeColor="accent1" w:themeShade="BF"/>
     </w:rPr>
   </w:style>
-  <w:style w:type="character" w:customStyle="1" w:styleId="50">
-    <w:name w:val="หัวเรื่อง 5 อักขระ"/>
-    <w:basedOn w:val="a0"/>
-    <w:link w:val="5"/>
+  <w:style w:type="character" w:customStyle="1" w:styleId="Heading5Char">
+    <w:name w:val="Heading 5 Char"/>
+    <w:basedOn w:val="DefaultParagraphFont"/>
+    <w:link w:val="Heading5"/>
     <w:uiPriority w:val="9"/>
     <w:semiHidden/>
     <w:rsid w:val="00006ED1"/>
@@ -1532,10 +2330,10 @@
       <w:color w:val="2F5496" w:themeColor="accent1" w:themeShade="BF"/>
     </w:rPr>
   </w:style>
-  <w:style w:type="character" w:customStyle="1" w:styleId="60">
-    <w:name w:val="หัวเรื่อง 6 อักขระ"/>
-    <w:basedOn w:val="a0"/>
-    <w:link w:val="6"/>
+  <w:style w:type="character" w:customStyle="1" w:styleId="Heading6Char">
+    <w:name w:val="Heading 6 Char"/>
+    <w:basedOn w:val="DefaultParagraphFont"/>
+    <w:link w:val="Heading6"/>
     <w:uiPriority w:val="9"/>
     <w:semiHidden/>
     <w:rsid w:val="00006ED1"/>
@@ -1546,10 +2344,10 @@
       <w:color w:val="595959" w:themeColor="text1" w:themeTint="A6"/>
     </w:rPr>
   </w:style>
-  <w:style w:type="character" w:customStyle="1" w:styleId="70">
-    <w:name w:val="หัวเรื่อง 7 อักขระ"/>
-    <w:basedOn w:val="a0"/>
-    <w:link w:val="7"/>
+  <w:style w:type="character" w:customStyle="1" w:styleId="Heading7Char">
+    <w:name w:val="Heading 7 Char"/>
+    <w:basedOn w:val="DefaultParagraphFont"/>
+    <w:link w:val="Heading7"/>
     <w:uiPriority w:val="9"/>
     <w:semiHidden/>
     <w:rsid w:val="00006ED1"/>
@@ -1558,10 +2356,10 @@
       <w:color w:val="595959" w:themeColor="text1" w:themeTint="A6"/>
     </w:rPr>
   </w:style>
-  <w:style w:type="character" w:customStyle="1" w:styleId="80">
-    <w:name w:val="หัวเรื่อง 8 อักขระ"/>
-    <w:basedOn w:val="a0"/>
-    <w:link w:val="8"/>
+  <w:style w:type="character" w:customStyle="1" w:styleId="Heading8Char">
+    <w:name w:val="Heading 8 Char"/>
+    <w:basedOn w:val="DefaultParagraphFont"/>
+    <w:link w:val="Heading8"/>
     <w:uiPriority w:val="9"/>
     <w:semiHidden/>
     <w:rsid w:val="00006ED1"/>
@@ -1572,10 +2370,10 @@
       <w:color w:val="272727" w:themeColor="text1" w:themeTint="D8"/>
     </w:rPr>
   </w:style>
-  <w:style w:type="character" w:customStyle="1" w:styleId="90">
-    <w:name w:val="หัวเรื่อง 9 อักขระ"/>
-    <w:basedOn w:val="a0"/>
-    <w:link w:val="9"/>
+  <w:style w:type="character" w:customStyle="1" w:styleId="Heading9Char">
+    <w:name w:val="Heading 9 Char"/>
+    <w:basedOn w:val="DefaultParagraphFont"/>
+    <w:link w:val="Heading9"/>
     <w:uiPriority w:val="9"/>
     <w:semiHidden/>
     <w:rsid w:val="00006ED1"/>
@@ -1584,11 +2382,11 @@
       <w:color w:val="272727" w:themeColor="text1" w:themeTint="D8"/>
     </w:rPr>
   </w:style>
-  <w:style w:type="paragraph" w:styleId="a3">
+  <w:style w:type="paragraph" w:styleId="Title">
     <w:name w:val="Title"/>
-    <w:basedOn w:val="a"/>
-    <w:next w:val="a"/>
-    <w:link w:val="a4"/>
+    <w:basedOn w:val="Normal"/>
+    <w:next w:val="Normal"/>
+    <w:link w:val="TitleChar"/>
     <w:uiPriority w:val="10"/>
     <w:qFormat/>
     <w:rsid w:val="00006ED1"/>
@@ -1604,10 +2402,10 @@
       <w:szCs w:val="71"/>
     </w:rPr>
   </w:style>
-  <w:style w:type="character" w:customStyle="1" w:styleId="a4">
-    <w:name w:val="ชื่อเรื่อง อักขระ"/>
-    <w:basedOn w:val="a0"/>
-    <w:link w:val="a3"/>
+  <w:style w:type="character" w:customStyle="1" w:styleId="TitleChar">
+    <w:name w:val="Title Char"/>
+    <w:basedOn w:val="DefaultParagraphFont"/>
+    <w:link w:val="Title"/>
     <w:uiPriority w:val="10"/>
     <w:rsid w:val="00006ED1"/>
     <w:rPr>
@@ -1618,11 +2416,11 @@
       <w:szCs w:val="71"/>
     </w:rPr>
   </w:style>
-  <w:style w:type="paragraph" w:styleId="a5">
+  <w:style w:type="paragraph" w:styleId="Subtitle">
     <w:name w:val="Subtitle"/>
-    <w:basedOn w:val="a"/>
-    <w:next w:val="a"/>
-    <w:link w:val="a6"/>
+    <w:basedOn w:val="Normal"/>
+    <w:next w:val="Normal"/>
+    <w:link w:val="SubtitleChar"/>
     <w:uiPriority w:val="11"/>
     <w:qFormat/>
     <w:rsid w:val="00006ED1"/>
@@ -1639,10 +2437,10 @@
       <w:szCs w:val="35"/>
     </w:rPr>
   </w:style>
-  <w:style w:type="character" w:customStyle="1" w:styleId="a6">
-    <w:name w:val="ชื่อเรื่องรอง อักขระ"/>
-    <w:basedOn w:val="a0"/>
-    <w:link w:val="a5"/>
+  <w:style w:type="character" w:customStyle="1" w:styleId="SubtitleChar">
+    <w:name w:val="Subtitle Char"/>
+    <w:basedOn w:val="DefaultParagraphFont"/>
+    <w:link w:val="Subtitle"/>
     <w:uiPriority w:val="11"/>
     <w:rsid w:val="00006ED1"/>
     <w:rPr>
@@ -1653,11 +2451,11 @@
       <w:szCs w:val="35"/>
     </w:rPr>
   </w:style>
-  <w:style w:type="paragraph" w:styleId="a7">
+  <w:style w:type="paragraph" w:styleId="Quote">
     <w:name w:val="Quote"/>
-    <w:basedOn w:val="a"/>
-    <w:next w:val="a"/>
-    <w:link w:val="a8"/>
+    <w:basedOn w:val="Normal"/>
+    <w:next w:val="Normal"/>
+    <w:link w:val="QuoteChar"/>
     <w:uiPriority w:val="29"/>
     <w:qFormat/>
     <w:rsid w:val="00006ED1"/>
@@ -1671,10 +2469,10 @@
       <w:color w:val="404040" w:themeColor="text1" w:themeTint="BF"/>
     </w:rPr>
   </w:style>
-  <w:style w:type="character" w:customStyle="1" w:styleId="a8">
-    <w:name w:val="คำอ้างอิง อักขระ"/>
-    <w:basedOn w:val="a0"/>
-    <w:link w:val="a7"/>
+  <w:style w:type="character" w:customStyle="1" w:styleId="QuoteChar">
+    <w:name w:val="Quote Char"/>
+    <w:basedOn w:val="DefaultParagraphFont"/>
+    <w:link w:val="Quote"/>
     <w:uiPriority w:val="29"/>
     <w:rsid w:val="00006ED1"/>
     <w:rPr>
@@ -1683,9 +2481,9 @@
       <w:color w:val="404040" w:themeColor="text1" w:themeTint="BF"/>
     </w:rPr>
   </w:style>
-  <w:style w:type="paragraph" w:styleId="a9">
+  <w:style w:type="paragraph" w:styleId="ListParagraph">
     <w:name w:val="List Paragraph"/>
-    <w:basedOn w:val="a"/>
+    <w:basedOn w:val="Normal"/>
     <w:uiPriority w:val="34"/>
     <w:qFormat/>
     <w:rsid w:val="00006ED1"/>
@@ -1694,9 +2492,9 @@
       <w:contextualSpacing/>
     </w:pPr>
   </w:style>
-  <w:style w:type="character" w:styleId="aa">
+  <w:style w:type="character" w:styleId="IntenseEmphasis">
     <w:name w:val="Intense Emphasis"/>
-    <w:basedOn w:val="a0"/>
+    <w:basedOn w:val="DefaultParagraphFont"/>
     <w:uiPriority w:val="21"/>
     <w:qFormat/>
     <w:rsid w:val="00006ED1"/>
@@ -1706,11 +2504,11 @@
       <w:color w:val="2F5496" w:themeColor="accent1" w:themeShade="BF"/>
     </w:rPr>
   </w:style>
-  <w:style w:type="paragraph" w:styleId="ab">
+  <w:style w:type="paragraph" w:styleId="IntenseQuote">
     <w:name w:val="Intense Quote"/>
-    <w:basedOn w:val="a"/>
-    <w:next w:val="a"/>
-    <w:link w:val="ac"/>
+    <w:basedOn w:val="Normal"/>
+    <w:next w:val="Normal"/>
+    <w:link w:val="IntenseQuoteChar"/>
     <w:uiPriority w:val="30"/>
     <w:qFormat/>
     <w:rsid w:val="00006ED1"/>
@@ -1729,10 +2527,10 @@
       <w:color w:val="2F5496" w:themeColor="accent1" w:themeShade="BF"/>
     </w:rPr>
   </w:style>
-  <w:style w:type="character" w:customStyle="1" w:styleId="ac">
-    <w:name w:val="ทำให้คำอ้างอิงเป็นสีเข้มขึ้น อักขระ"/>
-    <w:basedOn w:val="a0"/>
-    <w:link w:val="ab"/>
+  <w:style w:type="character" w:customStyle="1" w:styleId="IntenseQuoteChar">
+    <w:name w:val="Intense Quote Char"/>
+    <w:basedOn w:val="DefaultParagraphFont"/>
+    <w:link w:val="IntenseQuote"/>
     <w:uiPriority w:val="30"/>
     <w:rsid w:val="00006ED1"/>
     <w:rPr>
@@ -1741,9 +2539,9 @@
       <w:color w:val="2F5496" w:themeColor="accent1" w:themeShade="BF"/>
     </w:rPr>
   </w:style>
-  <w:style w:type="character" w:styleId="ad">
+  <w:style w:type="character" w:styleId="IntenseReference">
     <w:name w:val="Intense Reference"/>
-    <w:basedOn w:val="a0"/>
+    <w:basedOn w:val="DefaultParagraphFont"/>
     <w:uiPriority w:val="32"/>
     <w:qFormat/>
     <w:rsid w:val="00006ED1"/>
@@ -1755,9 +2553,9 @@
       <w:spacing w:val="5"/>
     </w:rPr>
   </w:style>
-  <w:style w:type="table" w:styleId="ae">
+  <w:style w:type="table" w:styleId="TableGrid">
     <w:name w:val="Table Grid"/>
-    <w:basedOn w:val="a1"/>
+    <w:basedOn w:val="TableNormal"/>
     <w:uiPriority w:val="39"/>
     <w:rsid w:val="002B5946"/>
     <w:pPr>

</xml_diff>